<commit_message>
docs: documentos actualizados a servlets y jsp
</commit_message>
<xml_diff>
--- a/documentos/fase2/06_Conexion_Aplicacion_Web.docx
+++ b/documentos/fase2/06_Conexion_Aplicacion_Web.docx
@@ -396,19 +396,38 @@
           <w:bCs/>
           <w:lang w:val="es-CO"/>
         </w:rPr>
-        <w:t xml:space="preserve">Java 21 con Spring Boot</w:t>
-      </w:r>
-      <w:r>
-        <w:rPr>
-          <w:lang w:val="es-CO"/>
-        </w:rPr>
-        <w:t xml:space="preserve"> </w:t>
-      </w:r>
-      <w:r>
-        <w:rPr>
-          <w:lang w:val="es-CO"/>
-        </w:rPr>
-        <w:t xml:space="preserve">y corre</w:t>
+        <w:t xml:space="preserve">Java 21 con Servlets y JSP</w:t>
+      </w:r>
+      <w:r>
+        <w:rPr>
+          <w:lang w:val="es-CO"/>
+        </w:rPr>
+        <w:t xml:space="preserve">, sin frameworks, y se despliega como</w:t>
+      </w:r>
+      <w:r>
+        <w:rPr>
+          <w:lang w:val="es-CO"/>
+        </w:rPr>
+        <w:t xml:space="preserve"> </w:t>
+      </w:r>
+      <w:r>
+        <w:rPr>
+          <w:rStyle w:val="VerbatimChar"/>
+          <w:lang w:val="es-CO"/>
+        </w:rPr>
+        <w:t xml:space="preserve">ROOT.war</w:t>
+      </w:r>
+      <w:r>
+        <w:rPr>
+          <w:lang w:val="es-CO"/>
+        </w:rPr>
+        <w:t xml:space="preserve"> </w:t>
+      </w:r>
+      <w:r>
+        <w:rPr>
+          <w:lang w:val="es-CO"/>
+        </w:rPr>
+        <w:t xml:space="preserve">en</w:t>
       </w:r>
       <w:r>
         <w:rPr>
@@ -422,25 +441,45 @@
           <w:bCs/>
           <w:lang w:val="es-CO"/>
         </w:rPr>
+        <w:t xml:space="preserve">Apache Tomcat 10.1</w:t>
+      </w:r>
+      <w:r>
+        <w:rPr>
+          <w:lang w:val="es-CO"/>
+        </w:rPr>
+        <w:t xml:space="preserve">. Tomcat corre</w:t>
+      </w:r>
+      <w:r>
+        <w:rPr>
+          <w:lang w:val="es-CO"/>
+        </w:rPr>
+        <w:t xml:space="preserve"> </w:t>
+      </w:r>
+      <w:r>
+        <w:rPr>
+          <w:b/>
+          <w:bCs/>
+          <w:lang w:val="es-CO"/>
+        </w:rPr>
         <w:t xml:space="preserve">dentro de la máquina virtual</w:t>
       </w:r>
       <w:r>
         <w:rPr>
           <w:lang w:val="es-CO"/>
         </w:rPr>
-        <w:t xml:space="preserve">, junto a Oracle,</w:t>
-      </w:r>
-      <w:r>
-        <w:rPr>
-          <w:lang w:val="es-CO"/>
-        </w:rPr>
-        <w:t xml:space="preserve"> </w:t>
-      </w:r>
-      <w:r>
-        <w:rPr>
-          <w:lang w:val="es-CO"/>
-        </w:rPr>
-        <w:t xml:space="preserve">como un servicio del sistema (</w:t>
+        <w:t xml:space="preserve">, junto a Oracle, como un servicio del sistema</w:t>
+      </w:r>
+      <w:r>
+        <w:rPr>
+          <w:lang w:val="es-CO"/>
+        </w:rPr>
+        <w:t xml:space="preserve"> </w:t>
+      </w:r>
+      <w:r>
+        <w:rPr>
+          <w:lang w:val="es-CO"/>
+        </w:rPr>
+        <w:t xml:space="preserve">(</w:t>
       </w:r>
       <w:r>
         <w:rPr>
@@ -453,7 +492,7 @@
         <w:rPr>
           <w:lang w:val="es-CO"/>
         </w:rPr>
-        <w:t xml:space="preserve">). Desde el equipo anfitrión solo se abre el navegador en el puerto 5000.</w:t>
+        <w:t xml:space="preserve">) en el puerto 5000. Desde el equipo anfitrión solo se abre el navegador.</w:t>
       </w:r>
     </w:p>
     <w:p>
@@ -465,7 +504,7 @@
           <w:rStyle w:val="VerbatimChar"/>
           <w:lang w:val="es-CO"/>
         </w:rPr>
-        <w:t xml:space="preserve">Navegador ──HTTP 5000──▶ Spring Boot (controladores) ──▶ SQL escrito a mano (Consultas.java)</w:t>
+        <w:t xml:space="preserve">Navegador ──HTTP 5000──▶ Tomcat ──▶ Servlets ──▶ SQL escrito a mano (Consultas.java)</w:t>
       </w:r>
       <w:r>
         <w:br/>
@@ -475,7 +514,7 @@
           <w:rStyle w:val="VerbatimChar"/>
           <w:lang w:val="es-CO"/>
         </w:rPr>
-        <w:t xml:space="preserve">                                                              │ JDBC: PreparedStatement + driver Oracle (ojdbc)</w:t>
+        <w:t xml:space="preserve">                                       │              │ JDBC: DriverManager + PreparedStatement (ojdbc)</w:t>
       </w:r>
       <w:r>
         <w:br/>
@@ -485,7 +524,7 @@
           <w:rStyle w:val="VerbatimChar"/>
           <w:lang w:val="es-CO"/>
         </w:rPr>
-        <w:t xml:space="preserve">                                                              ▼</w:t>
+        <w:t xml:space="preserve">                                       ▼              ▼</w:t>
       </w:r>
       <w:r>
         <w:br/>
@@ -495,7 +534,7 @@
           <w:rStyle w:val="VerbatimChar"/>
           <w:lang w:val="es-CO"/>
         </w:rPr>
-        <w:t xml:space="preserve">                             Oracle Database Free · PDB FREEPDB1 · esquema VETDB (usuario VET_APP)</w:t>
+        <w:t xml:space="preserve">                                 Páginas JSP    Oracle Database Free · PDB FREEPDB1 · esquema VETDB (usuario VET_APP)</w:t>
       </w:r>
     </w:p>
     <w:p>
@@ -556,7 +595,7 @@
                 <w:sz w:val="19"/>
                 <w:lang w:val="es-CO"/>
               </w:rPr>
-              <w:t xml:space="preserve">app/src/main/java/co/edu/unbosque/sigevet/</w:t>
+              <w:t xml:space="preserve">app/src/main/</w:t>
             </w:r>
             <w:r>
               <w:rPr>
@@ -600,7 +639,7 @@
                 <w:sz w:val="19"/>
                 <w:lang w:val="es-CO"/>
               </w:rPr>
-              <w:t xml:space="preserve">SigevetApplication.java</w:t>
+              <w:t xml:space="preserve">java/.../Conexion.java</w:t>
             </w:r>
           </w:p>
         </w:tc>
@@ -615,7 +654,51 @@
                 <w:sz w:val="19"/>
                 <w:lang w:val="es-CO"/>
               </w:rPr>
-              <w:t xml:space="preserve">Arranca la aplicación Spring Boot</w:t>
+              <w:t xml:space="preserve">Abre la conexión con</w:t>
+            </w:r>
+            <w:r>
+              <w:rPr>
+                <w:sz w:val="19"/>
+                <w:lang w:val="es-CO"/>
+              </w:rPr>
+              <w:t xml:space="preserve"> </w:t>
+            </w:r>
+            <w:r>
+              <w:rPr>
+                <w:rStyle w:val="VerbatimChar"/>
+                <w:sz w:val="19"/>
+                <w:lang w:val="es-CO"/>
+              </w:rPr>
+              <w:t xml:space="preserve">DriverManager</w:t>
+            </w:r>
+            <w:r>
+              <w:rPr>
+                <w:sz w:val="19"/>
+                <w:lang w:val="es-CO"/>
+              </w:rPr>
+              <w:t xml:space="preserve"> </w:t>
+            </w:r>
+            <w:r>
+              <w:rPr>
+                <w:sz w:val="19"/>
+                <w:lang w:val="es-CO"/>
+              </w:rPr>
+              <w:t xml:space="preserve">usando las variables de entorno y fija el esquema</w:t>
+            </w:r>
+            <w:r>
+              <w:rPr>
+                <w:sz w:val="19"/>
+                <w:lang w:val="es-CO"/>
+              </w:rPr>
+              <w:t xml:space="preserve"> </w:t>
+            </w:r>
+            <w:r>
+              <w:rPr>
+                <w:rStyle w:val="VerbatimChar"/>
+                <w:sz w:val="19"/>
+                <w:lang w:val="es-CO"/>
+              </w:rPr>
+              <w:t xml:space="preserve">VETDB</w:t>
             </w:r>
           </w:p>
         </w:tc>
@@ -633,7 +716,7 @@
                 <w:sz w:val="19"/>
                 <w:lang w:val="es-CO"/>
               </w:rPr>
-              <w:t xml:space="preserve">BaseDatos.java</w:t>
+              <w:t xml:space="preserve">java/.../BaseDatos.java</w:t>
             </w:r>
           </w:p>
         </w:tc>
@@ -648,7 +731,14 @@
                 <w:sz w:val="19"/>
                 <w:lang w:val="es-CO"/>
               </w:rPr>
-              <w:t xml:space="preserve">Ejecuta el SQL con JDBC (</w:t>
+              <w:t xml:space="preserve">Ejecuta el SQL con</w:t>
+            </w:r>
+            <w:r>
+              <w:rPr>
+                <w:sz w:val="19"/>
+                <w:lang w:val="es-CO"/>
+              </w:rPr>
+              <w:t xml:space="preserve"> </w:t>
             </w:r>
             <w:r>
               <w:rPr>
@@ -692,7 +782,14 @@
                 <w:sz w:val="19"/>
                 <w:lang w:val="es-CO"/>
               </w:rPr>
-              <w:t xml:space="preserve">) y devuelve las filas</w:t>
+              <w:t xml:space="preserve"> </w:t>
+            </w:r>
+            <w:r>
+              <w:rPr>
+                <w:sz w:val="19"/>
+                <w:lang w:val="es-CO"/>
+              </w:rPr>
+              <w:t xml:space="preserve">y devuelve las filas</w:t>
             </w:r>
           </w:p>
         </w:tc>
@@ -710,7 +807,7 @@
                 <w:sz w:val="19"/>
                 <w:lang w:val="es-CO"/>
               </w:rPr>
-              <w:t xml:space="preserve">Consultas.java</w:t>
+              <w:t xml:space="preserve">java/.../Consultas.java</w:t>
             </w:r>
           </w:p>
         </w:tc>
@@ -743,51 +840,7 @@
                 <w:sz w:val="19"/>
                 <w:lang w:val="es-CO"/>
               </w:rPr>
-              <w:t xml:space="preserve">InicioController.java</w:t>
-            </w:r>
-            <w:r>
-              <w:rPr>
-                <w:sz w:val="19"/>
-                <w:lang w:val="es-CO"/>
-              </w:rPr>
-              <w:t xml:space="preserve">,</w:t>
-            </w:r>
-            <w:r>
-              <w:rPr>
-                <w:sz w:val="19"/>
-                <w:lang w:val="es-CO"/>
-              </w:rPr>
-              <w:t xml:space="preserve"> </w:t>
-            </w:r>
-            <w:r>
-              <w:rPr>
-                <w:rStyle w:val="VerbatimChar"/>
-                <w:sz w:val="19"/>
-                <w:lang w:val="es-CO"/>
-              </w:rPr>
-              <w:t xml:space="preserve">ClientesController.java</w:t>
-            </w:r>
-            <w:r>
-              <w:rPr>
-                <w:sz w:val="19"/>
-                <w:lang w:val="es-CO"/>
-              </w:rPr>
-              <w:t xml:space="preserve">,</w:t>
-            </w:r>
-            <w:r>
-              <w:rPr>
-                <w:sz w:val="19"/>
-                <w:lang w:val="es-CO"/>
-              </w:rPr>
-              <w:t xml:space="preserve"> </w:t>
-            </w:r>
-            <w:r>
-              <w:rPr>
-                <w:rStyle w:val="VerbatimChar"/>
-                <w:sz w:val="19"/>
-                <w:lang w:val="es-CO"/>
-              </w:rPr>
-              <w:t xml:space="preserve">OperacionController.java</w:t>
+              <w:t xml:space="preserve">java/.../*Servlet.java</w:t>
             </w:r>
           </w:p>
         </w:tc>
@@ -802,7 +855,7 @@
                 <w:sz w:val="19"/>
                 <w:lang w:val="es-CO"/>
               </w:rPr>
-              <w:t xml:space="preserve">Las páginas: inicio, clientes y mascotas, agenda, inventario, facturas y personal</w:t>
+              <w:t xml:space="preserve">Un servlet por página: inicio, clientes, cliente, mascota, agenda, inventario, facturas, factura, personal y álgebra</w:t>
             </w:r>
           </w:p>
         </w:tc>
@@ -820,29 +873,7 @@
                 <w:sz w:val="19"/>
                 <w:lang w:val="es-CO"/>
               </w:rPr>
-              <w:t xml:space="preserve">AlgebraController.java</w:t>
-            </w:r>
-            <w:r>
-              <w:rPr>
-                <w:sz w:val="19"/>
-                <w:lang w:val="es-CO"/>
-              </w:rPr>
-              <w:t xml:space="preserve">,</w:t>
-            </w:r>
-            <w:r>
-              <w:rPr>
-                <w:sz w:val="19"/>
-                <w:lang w:val="es-CO"/>
-              </w:rPr>
-              <w:t xml:space="preserve"> </w:t>
-            </w:r>
-            <w:r>
-              <w:rPr>
-                <w:rStyle w:val="VerbatimChar"/>
-                <w:sz w:val="19"/>
-                <w:lang w:val="es-CO"/>
-              </w:rPr>
-              <w:t xml:space="preserve">Algebra.java</w:t>
+              <w:t xml:space="preserve">java/.../Parametros.java</w:t>
             </w:r>
           </w:p>
         </w:tc>
@@ -857,22 +888,7 @@
                 <w:sz w:val="19"/>
                 <w:lang w:val="es-CO"/>
               </w:rPr>
-              <w:t xml:space="preserve">Leen y ejecutan los 55 ejercicios del script</w:t>
-            </w:r>
-            <w:r>
-              <w:rPr>
-                <w:sz w:val="19"/>
-                <w:lang w:val="es-CO"/>
-              </w:rPr>
-              <w:t xml:space="preserve"> </w:t>
-            </w:r>
-            <w:r>
-              <w:rPr>
-                <w:rStyle w:val="VerbatimChar"/>
-                <w:sz w:val="19"/>
-                <w:lang w:val="es-CO"/>
-              </w:rPr>
-              <w:t xml:space="preserve">01_consultas_algebra_relacional.sql</w:t>
+              <w:t xml:space="preserve">Lee y valida los parámetros de la URL (números, fechas y página)</w:t>
             </w:r>
           </w:p>
         </w:tc>
@@ -890,7 +906,7 @@
                 <w:sz w:val="19"/>
                 <w:lang w:val="es-CO"/>
               </w:rPr>
-              <w:t xml:space="preserve">Formato.java</w:t>
+              <w:t xml:space="preserve">java/.../Algebra.java</w:t>
             </w:r>
           </w:p>
         </w:tc>
@@ -905,7 +921,22 @@
                 <w:sz w:val="19"/>
                 <w:lang w:val="es-CO"/>
               </w:rPr>
-              <w:t xml:space="preserve">Formato de fechas (dd/MM/yyyy) y de dinero ($ 364.000)</w:t>
+              <w:t xml:space="preserve">Lee los 55 ejercicios del script</w:t>
+            </w:r>
+            <w:r>
+              <w:rPr>
+                <w:sz w:val="19"/>
+                <w:lang w:val="es-CO"/>
+              </w:rPr>
+              <w:t xml:space="preserve"> </w:t>
+            </w:r>
+            <w:r>
+              <w:rPr>
+                <w:rStyle w:val="VerbatimChar"/>
+                <w:sz w:val="19"/>
+                <w:lang w:val="es-CO"/>
+              </w:rPr>
+              <w:t xml:space="preserve">01_consultas_algebra_relacional.sql</w:t>
             </w:r>
           </w:p>
         </w:tc>
@@ -923,7 +954,36 @@
                 <w:sz w:val="19"/>
                 <w:lang w:val="es-CO"/>
               </w:rPr>
-              <w:t xml:space="preserve">src/main/resources/templates/</w:t>
+              <w:t xml:space="preserve">java/.../Formato.java</w:t>
+            </w:r>
+            <w:r>
+              <w:rPr>
+                <w:sz w:val="19"/>
+                <w:lang w:val="es-CO"/>
+              </w:rPr>
+              <w:t xml:space="preserve"> </w:t>
+            </w:r>
+            <w:r>
+              <w:rPr>
+                <w:sz w:val="19"/>
+                <w:lang w:val="es-CO"/>
+              </w:rPr>
+              <w:t xml:space="preserve">y</w:t>
+            </w:r>
+            <w:r>
+              <w:rPr>
+                <w:sz w:val="19"/>
+                <w:lang w:val="es-CO"/>
+              </w:rPr>
+              <w:t xml:space="preserve"> </w:t>
+            </w:r>
+            <w:r>
+              <w:rPr>
+                <w:rStyle w:val="VerbatimChar"/>
+                <w:sz w:val="19"/>
+                <w:lang w:val="es-CO"/>
+              </w:rPr>
+              <w:t xml:space="preserve">webapp/WEB-INF/sigevet.tld</w:t>
             </w:r>
           </w:p>
         </w:tc>
@@ -938,7 +998,7 @@
                 <w:sz w:val="19"/>
                 <w:lang w:val="es-CO"/>
               </w:rPr>
-              <w:t xml:space="preserve">Páginas HTML con Thymeleaf</w:t>
+              <w:t xml:space="preserve">Formato de fechas (dd/MM/yyyy) y de dinero ($ 364.000) para usar en las JSP</w:t>
             </w:r>
           </w:p>
         </w:tc>
@@ -956,7 +1016,7 @@
                 <w:sz w:val="19"/>
                 <w:lang w:val="es-CO"/>
               </w:rPr>
-              <w:t xml:space="preserve">src/main/resources/application.properties</w:t>
+              <w:t xml:space="preserve">webapp/WEB-INF/jsp/*.jsp</w:t>
             </w:r>
           </w:p>
         </w:tc>
@@ -971,7 +1031,40 @@
                 <w:sz w:val="19"/>
                 <w:lang w:val="es-CO"/>
               </w:rPr>
-              <w:t xml:space="preserve">Puerto 5000 y datos de conexión (tomados de variables de entorno)</w:t>
+              <w:t xml:space="preserve">Páginas HTML con JSP y JSTL</w:t>
+            </w:r>
+          </w:p>
+        </w:tc>
+      </w:tr>
+      <w:tr>
+        <w:tc>
+          <w:tcPr/>
+          <w:p>
+            <w:pPr>
+              <w:pStyle w:val="Compact"/>
+            </w:pPr>
+            <w:r>
+              <w:rPr>
+                <w:rStyle w:val="VerbatimChar"/>
+                <w:sz w:val="19"/>
+                <w:lang w:val="es-CO"/>
+              </w:rPr>
+              <w:t xml:space="preserve">webapp/WEB-INF/web.xml</w:t>
+            </w:r>
+          </w:p>
+        </w:tc>
+        <w:tc>
+          <w:tcPr/>
+          <w:p>
+            <w:pPr>
+              <w:pStyle w:val="Compact"/>
+            </w:pPr>
+            <w:r>
+              <w:rPr>
+                <w:sz w:val="19"/>
+                <w:lang w:val="es-CO"/>
+              </w:rPr>
+              <w:t xml:space="preserve">Páginas de error 404 y 500, y codificación UTF-8</w:t>
             </w:r>
           </w:p>
         </w:tc>
@@ -987,43 +1080,55 @@
           <w:bCs/>
           <w:lang w:val="es-CO"/>
         </w:rPr>
-        <w:t xml:space="preserve">Sin ORM.</w:t>
-      </w:r>
-      <w:r>
-        <w:rPr>
-          <w:lang w:val="es-CO"/>
-        </w:rPr>
-        <w:t xml:space="preserve"> </w:t>
-      </w:r>
-      <w:r>
-        <w:rPr>
-          <w:lang w:val="es-CO"/>
-        </w:rPr>
-        <w:t xml:space="preserve">La aplicación no usa JPA, Hibernate, Spring Data ni ninguna herramienta que genere SQL de forma</w:t>
-      </w:r>
-      <w:r>
-        <w:rPr>
-          <w:lang w:val="es-CO"/>
-        </w:rPr>
-        <w:t xml:space="preserve"> </w:t>
-      </w:r>
-      <w:r>
-        <w:rPr>
-          <w:lang w:val="es-CO"/>
-        </w:rPr>
-        <w:t xml:space="preserve">automática. Cada consulta está escrita en SQL de Oracle y se ejecuta tal cual con JDBC. Así se ve la relación directa</w:t>
-      </w:r>
-      <w:r>
-        <w:rPr>
-          <w:lang w:val="es-CO"/>
-        </w:rPr>
-        <w:t xml:space="preserve"> </w:t>
-      </w:r>
-      <w:r>
-        <w:rPr>
-          <w:lang w:val="es-CO"/>
-        </w:rPr>
-        <w:t xml:space="preserve">entre las consultas de la aplicación, el modelo relacional y el álgebra relacional de la Fase 1.</w:t>
+        <w:t xml:space="preserve">Sin frameworks ni ORM.</w:t>
+      </w:r>
+      <w:r>
+        <w:rPr>
+          <w:lang w:val="es-CO"/>
+        </w:rPr>
+        <w:t xml:space="preserve"> </w:t>
+      </w:r>
+      <w:r>
+        <w:rPr>
+          <w:lang w:val="es-CO"/>
+        </w:rPr>
+        <w:t xml:space="preserve">La aplicación no usa Spring, JPA, Hibernate ni ninguna herramienta que genere SQL de</w:t>
+      </w:r>
+      <w:r>
+        <w:rPr>
+          <w:lang w:val="es-CO"/>
+        </w:rPr>
+        <w:t xml:space="preserve"> </w:t>
+      </w:r>
+      <w:r>
+        <w:rPr>
+          <w:lang w:val="es-CO"/>
+        </w:rPr>
+        <w:t xml:space="preserve">forma automática. Cada servlet recibe la petición, ejecuta su consulta SQL con JDBC y le pasa las filas a una página</w:t>
+      </w:r>
+      <w:r>
+        <w:rPr>
+          <w:lang w:val="es-CO"/>
+        </w:rPr>
+        <w:t xml:space="preserve"> </w:t>
+      </w:r>
+      <w:r>
+        <w:rPr>
+          <w:lang w:val="es-CO"/>
+        </w:rPr>
+        <w:t xml:space="preserve">JSP. Así se ve la relación directa entre las consultas de la aplicación, el modelo relacional y el álgebra relacional</w:t>
+      </w:r>
+      <w:r>
+        <w:rPr>
+          <w:lang w:val="es-CO"/>
+        </w:rPr>
+        <w:t xml:space="preserve"> </w:t>
+      </w:r>
+      <w:r>
+        <w:rPr>
+          <w:lang w:val="es-CO"/>
+        </w:rPr>
+        <w:t xml:space="preserve">de la Fase 1.</w:t>
       </w:r>
     </w:p>
     <w:p>
@@ -1126,33 +1231,7 @@
         <w:rPr>
           <w:lang w:val="es-CO"/>
         </w:rPr>
-        <w:t xml:space="preserve">red de Oracle sin instalar Oracle Client. Spring Boot arma el</w:t>
-      </w:r>
-      <w:r>
-        <w:rPr>
-          <w:lang w:val="es-CO"/>
-        </w:rPr>
-        <w:t xml:space="preserve"> </w:t>
-      </w:r>
-      <w:r>
-        <w:rPr>
-          <w:i/>
-          <w:iCs/>
-          <w:lang w:val="es-CO"/>
-        </w:rPr>
-        <w:t xml:space="preserve">pool</w:t>
-      </w:r>
-      <w:r>
-        <w:rPr>
-          <w:lang w:val="es-CO"/>
-        </w:rPr>
-        <w:t xml:space="preserve"> </w:t>
-      </w:r>
-      <w:r>
-        <w:rPr>
-          <w:lang w:val="es-CO"/>
-        </w:rPr>
-        <w:t xml:space="preserve">de conexiones con los datos de</w:t>
+        <w:t xml:space="preserve">red de Oracle sin instalar Oracle Client. Cada consulta abre una conexión con</w:t>
       </w:r>
       <w:r>
         <w:rPr>
@@ -1165,13 +1244,31 @@
           <w:rStyle w:val="VerbatimChar"/>
           <w:lang w:val="es-CO"/>
         </w:rPr>
-        <w:t xml:space="preserve">application.properties</w:t>
-      </w:r>
-      <w:r>
-        <w:rPr>
-          <w:lang w:val="es-CO"/>
-        </w:rPr>
-        <w:t xml:space="preserve">. Como</w:t>
+        <w:t xml:space="preserve">DriverManager</w:t>
+      </w:r>
+      <w:r>
+        <w:rPr>
+          <w:lang w:val="es-CO"/>
+        </w:rPr>
+        <w:t xml:space="preserve"> </w:t>
+      </w:r>
+      <w:r>
+        <w:rPr>
+          <w:lang w:val="es-CO"/>
+        </w:rPr>
+        <w:t xml:space="preserve">y la cierra al terminar.</w:t>
+      </w:r>
+      <w:r>
+        <w:rPr>
+          <w:lang w:val="es-CO"/>
+        </w:rPr>
+        <w:t xml:space="preserve"> </w:t>
+      </w:r>
+      <w:r>
+        <w:rPr>
+          <w:lang w:val="es-CO"/>
+        </w:rPr>
+        <w:t xml:space="preserve">Como</w:t>
       </w:r>
       <w:r>
         <w:rPr>
@@ -1196,7 +1293,7 @@
         <w:rPr>
           <w:lang w:val="es-CO"/>
         </w:rPr>
-        <w:t xml:space="preserve">no es dueño de las tablas, cada conexión fija el esquema</w:t>
+        <w:t xml:space="preserve">no es dueño de las tablas, al conectarse se fija el esquema</w:t>
       </w:r>
       <w:r>
         <w:rPr>
@@ -1221,7 +1318,20 @@
         <w:rPr>
           <w:lang w:val="es-CO"/>
         </w:rPr>
-        <w:t xml:space="preserve">al abrirse:</w:t>
+        <w:t xml:space="preserve">(</w:t>
+      </w:r>
+      <w:r>
+        <w:rPr>
+          <w:rStyle w:val="VerbatimChar"/>
+          <w:lang w:val="es-CO"/>
+        </w:rPr>
+        <w:t xml:space="preserve">Conexion.java</w:t>
+      </w:r>
+      <w:r>
+        <w:rPr>
+          <w:lang w:val="es-CO"/>
+        </w:rPr>
+        <w:t xml:space="preserve">):</w:t>
       </w:r>
     </w:p>
     <w:p>
@@ -1230,50 +1340,207 @@
       </w:pPr>
       <w:r>
         <w:rPr>
-          <w:rStyle w:val="VerbatimChar"/>
-          <w:lang w:val="es-CO"/>
-        </w:rPr>
-        <w:t xml:space="preserve">server.port=5000</w:t>
+          <w:rStyle w:val="BuiltInTok"/>
+        </w:rPr>
+        <w:t xml:space="preserve">Connection</w:t>
+      </w:r>
+      <w:r>
+        <w:rPr>
+          <w:rStyle w:val="NormalTok"/>
+        </w:rPr>
+        <w:t xml:space="preserve"> conexion </w:t>
+      </w:r>
+      <w:r>
+        <w:rPr>
+          <w:rStyle w:val="OperatorTok"/>
+        </w:rPr>
+        <w:t xml:space="preserve">=</w:t>
+      </w:r>
+      <w:r>
+        <w:rPr>
+          <w:rStyle w:val="NormalTok"/>
+        </w:rPr>
+        <w:t xml:space="preserve"> </w:t>
+      </w:r>
+      <w:r>
+        <w:rPr>
+          <w:rStyle w:val="BuiltInTok"/>
+        </w:rPr>
+        <w:t xml:space="preserve">DriverManager</w:t>
+      </w:r>
+      <w:r>
+        <w:rPr>
+          <w:rStyle w:val="OperatorTok"/>
+        </w:rPr>
+        <w:t xml:space="preserve">.</w:t>
+      </w:r>
+      <w:r>
+        <w:rPr>
+          <w:rStyle w:val="FunctionTok"/>
+        </w:rPr>
+        <w:t xml:space="preserve">getConnection</w:t>
+      </w:r>
+      <w:r>
+        <w:rPr>
+          <w:rStyle w:val="OperatorTok"/>
+        </w:rPr>
+        <w:t xml:space="preserve">(</w:t>
+      </w:r>
+      <w:r>
+        <w:rPr>
+          <w:rStyle w:val="NormalTok"/>
+        </w:rPr>
+        <w:t xml:space="preserve">url</w:t>
+      </w:r>
+      <w:r>
+        <w:rPr>
+          <w:rStyle w:val="OperatorTok"/>
+        </w:rPr>
+        <w:t xml:space="preserve">,</w:t>
+      </w:r>
+      <w:r>
+        <w:rPr>
+          <w:rStyle w:val="NormalTok"/>
+        </w:rPr>
+        <w:t xml:space="preserve"> usuario</w:t>
+      </w:r>
+      <w:r>
+        <w:rPr>
+          <w:rStyle w:val="OperatorTok"/>
+        </w:rPr>
+        <w:t xml:space="preserve">,</w:t>
+      </w:r>
+      <w:r>
+        <w:rPr>
+          <w:rStyle w:val="NormalTok"/>
+        </w:rPr>
+        <w:t xml:space="preserve"> clave</w:t>
+      </w:r>
+      <w:r>
+        <w:rPr>
+          <w:rStyle w:val="OperatorTok"/>
+        </w:rPr>
+        <w:t xml:space="preserve">);</w:t>
       </w:r>
       <w:r>
         <w:br/>
       </w:r>
       <w:r>
         <w:rPr>
-          <w:rStyle w:val="VerbatimChar"/>
-          <w:lang w:val="es-CO"/>
-        </w:rPr>
-        <w:t xml:space="preserve">spring.datasource.url=${SIGEVET_DB_URL:jdbc:oracle:thin:@//localhost:1521/FREEPDB1}</w:t>
+          <w:rStyle w:val="CommentTok"/>
+        </w:rPr>
+        <w:t xml:space="preserve">// VET_APP no es dueño de las tablas, por eso se cambia al esquema VETDB</w:t>
       </w:r>
       <w:r>
         <w:br/>
       </w:r>
       <w:r>
         <w:rPr>
-          <w:rStyle w:val="VerbatimChar"/>
-          <w:lang w:val="es-CO"/>
-        </w:rPr>
-        <w:t xml:space="preserve">spring.datasource.username=${SIGEVET_DB_USER:VET_APP}</w:t>
+          <w:rStyle w:val="BuiltInTok"/>
+        </w:rPr>
+        <w:t xml:space="preserve">Statement</w:t>
+      </w:r>
+      <w:r>
+        <w:rPr>
+          <w:rStyle w:val="NormalTok"/>
+        </w:rPr>
+        <w:t xml:space="preserve"> sentencia </w:t>
+      </w:r>
+      <w:r>
+        <w:rPr>
+          <w:rStyle w:val="OperatorTok"/>
+        </w:rPr>
+        <w:t xml:space="preserve">=</w:t>
+      </w:r>
+      <w:r>
+        <w:rPr>
+          <w:rStyle w:val="NormalTok"/>
+        </w:rPr>
+        <w:t xml:space="preserve"> conexion</w:t>
+      </w:r>
+      <w:r>
+        <w:rPr>
+          <w:rStyle w:val="OperatorTok"/>
+        </w:rPr>
+        <w:t xml:space="preserve">.</w:t>
+      </w:r>
+      <w:r>
+        <w:rPr>
+          <w:rStyle w:val="FunctionTok"/>
+        </w:rPr>
+        <w:t xml:space="preserve">createStatement</w:t>
+      </w:r>
+      <w:r>
+        <w:rPr>
+          <w:rStyle w:val="OperatorTok"/>
+        </w:rPr>
+        <w:t xml:space="preserve">();</w:t>
       </w:r>
       <w:r>
         <w:br/>
       </w:r>
       <w:r>
         <w:rPr>
-          <w:rStyle w:val="VerbatimChar"/>
-          <w:lang w:val="es-CO"/>
-        </w:rPr>
-        <w:t xml:space="preserve">spring.datasource.password=${SIGEVET_DB_PASSWORD:}</w:t>
+          <w:rStyle w:val="NormalTok"/>
+        </w:rPr>
+        <w:t xml:space="preserve">sentencia</w:t>
+      </w:r>
+      <w:r>
+        <w:rPr>
+          <w:rStyle w:val="OperatorTok"/>
+        </w:rPr>
+        <w:t xml:space="preserve">.</w:t>
+      </w:r>
+      <w:r>
+        <w:rPr>
+          <w:rStyle w:val="FunctionTok"/>
+        </w:rPr>
+        <w:t xml:space="preserve">execute</w:t>
+      </w:r>
+      <w:r>
+        <w:rPr>
+          <w:rStyle w:val="OperatorTok"/>
+        </w:rPr>
+        <w:t xml:space="preserve">(</w:t>
+      </w:r>
+      <w:r>
+        <w:rPr>
+          <w:rStyle w:val="StringTok"/>
+        </w:rPr>
+        <w:t xml:space="preserve">"ALTER SESSION SET CURRENT_SCHEMA = VETDB"</w:t>
+      </w:r>
+      <w:r>
+        <w:rPr>
+          <w:rStyle w:val="OperatorTok"/>
+        </w:rPr>
+        <w:t xml:space="preserve">);</w:t>
       </w:r>
       <w:r>
         <w:br/>
       </w:r>
       <w:r>
         <w:rPr>
-          <w:rStyle w:val="VerbatimChar"/>
-          <w:lang w:val="es-CO"/>
-        </w:rPr>
-        <w:t xml:space="preserve">spring.datasource.hikari.connection-init-sql=ALTER SESSION SET CURRENT_SCHEMA = VETDB</w:t>
+          <w:rStyle w:val="NormalTok"/>
+        </w:rPr>
+        <w:t xml:space="preserve">sentencia</w:t>
+      </w:r>
+      <w:r>
+        <w:rPr>
+          <w:rStyle w:val="OperatorTok"/>
+        </w:rPr>
+        <w:t xml:space="preserve">.</w:t>
+      </w:r>
+      <w:r>
+        <w:rPr>
+          <w:rStyle w:val="FunctionTok"/>
+        </w:rPr>
+        <w:t xml:space="preserve">close</w:t>
+      </w:r>
+      <w:r>
+        <w:rPr>
+          <w:rStyle w:val="OperatorTok"/>
+        </w:rPr>
+        <w:t xml:space="preserve">();</w:t>
       </w:r>
     </w:p>
     <w:p>
@@ -1585,7 +1852,7 @@
         <w:rPr>
           <w:lang w:val="es-CO"/>
         </w:rPr>
-        <w:t xml:space="preserve">Y así se ejecuta (</w:t>
+        <w:t xml:space="preserve">Así se ejecuta (</w:t>
       </w:r>
       <w:r>
         <w:rPr>
@@ -1645,7 +1912,7 @@
         <w:rPr>
           <w:rStyle w:val="NormalTok"/>
         </w:rPr>
-        <w:t xml:space="preserve"> fuente</w:t>
+        <w:t xml:space="preserve"> Conexion</w:t>
       </w:r>
       <w:r>
         <w:rPr>
@@ -1657,7 +1924,7 @@
         <w:rPr>
           <w:rStyle w:val="FunctionTok"/>
         </w:rPr>
-        <w:t xml:space="preserve">getConnection</w:t>
+        <w:t xml:space="preserve">obtener</w:t>
       </w:r>
       <w:r>
         <w:rPr>
@@ -2132,6 +2399,659 @@
           <w:rStyle w:val="OperatorTok"/>
         </w:rPr>
         <w:t xml:space="preserve">}</w:t>
+      </w:r>
+      <w:r>
+        <w:br/>
+      </w:r>
+      <w:r>
+        <w:rPr>
+          <w:rStyle w:val="NormalTok"/>
+        </w:rPr>
+        <w:t xml:space="preserve">    </w:t>
+      </w:r>
+      <w:r>
+        <w:rPr>
+          <w:rStyle w:val="OperatorTok"/>
+        </w:rPr>
+        <w:t xml:space="preserve">}</w:t>
+      </w:r>
+      <w:r>
+        <w:br/>
+      </w:r>
+      <w:r>
+        <w:rPr>
+          <w:rStyle w:val="OperatorTok"/>
+        </w:rPr>
+        <w:t xml:space="preserve">}</w:t>
+      </w:r>
+    </w:p>
+    <w:p>
+      <w:pPr>
+        <w:pStyle w:val="FirstParagraph"/>
+      </w:pPr>
+      <w:r>
+        <w:rPr>
+          <w:lang w:val="es-CO"/>
+        </w:rPr>
+        <w:t xml:space="preserve">Y un servlet completo (</w:t>
+      </w:r>
+      <w:r>
+        <w:rPr>
+          <w:rStyle w:val="VerbatimChar"/>
+          <w:lang w:val="es-CO"/>
+        </w:rPr>
+        <w:t xml:space="preserve">ClienteServlet.java</w:t>
+      </w:r>
+      <w:r>
+        <w:rPr>
+          <w:lang w:val="es-CO"/>
+        </w:rPr>
+        <w:t xml:space="preserve">, resumido):</w:t>
+      </w:r>
+    </w:p>
+    <w:p>
+      <w:pPr>
+        <w:pStyle w:val="SourceCode"/>
+      </w:pPr>
+      <w:r>
+        <w:rPr>
+          <w:rStyle w:val="AttributeTok"/>
+        </w:rPr>
+        <w:t xml:space="preserve">@WebServlet</w:t>
+      </w:r>
+      <w:r>
+        <w:rPr>
+          <w:rStyle w:val="OperatorTok"/>
+        </w:rPr>
+        <w:t xml:space="preserve">(</w:t>
+      </w:r>
+      <w:r>
+        <w:rPr>
+          <w:rStyle w:val="StringTok"/>
+        </w:rPr>
+        <w:t xml:space="preserve">"/clientes/*"</w:t>
+      </w:r>
+      <w:r>
+        <w:rPr>
+          <w:rStyle w:val="OperatorTok"/>
+        </w:rPr>
+        <w:t xml:space="preserve">)</w:t>
+      </w:r>
+      <w:r>
+        <w:br/>
+      </w:r>
+      <w:r>
+        <w:rPr>
+          <w:rStyle w:val="KeywordTok"/>
+        </w:rPr>
+        <w:t xml:space="preserve">public</w:t>
+      </w:r>
+      <w:r>
+        <w:rPr>
+          <w:rStyle w:val="NormalTok"/>
+        </w:rPr>
+        <w:t xml:space="preserve"> </w:t>
+      </w:r>
+      <w:r>
+        <w:rPr>
+          <w:rStyle w:val="KeywordTok"/>
+        </w:rPr>
+        <w:t xml:space="preserve">class</w:t>
+      </w:r>
+      <w:r>
+        <w:rPr>
+          <w:rStyle w:val="NormalTok"/>
+        </w:rPr>
+        <w:t xml:space="preserve"> ClienteServlet </w:t>
+      </w:r>
+      <w:r>
+        <w:rPr>
+          <w:rStyle w:val="KeywordTok"/>
+        </w:rPr>
+        <w:t xml:space="preserve">extends</w:t>
+      </w:r>
+      <w:r>
+        <w:rPr>
+          <w:rStyle w:val="NormalTok"/>
+        </w:rPr>
+        <w:t xml:space="preserve"> HttpServlet </w:t>
+      </w:r>
+      <w:r>
+        <w:rPr>
+          <w:rStyle w:val="OperatorTok"/>
+        </w:rPr>
+        <w:t xml:space="preserve">{</w:t>
+      </w:r>
+      <w:r>
+        <w:br/>
+      </w:r>
+      <w:r>
+        <w:rPr>
+          <w:rStyle w:val="NormalTok"/>
+        </w:rPr>
+        <w:t xml:space="preserve">    </w:t>
+      </w:r>
+      <w:r>
+        <w:rPr>
+          <w:rStyle w:val="KeywordTok"/>
+        </w:rPr>
+        <w:t xml:space="preserve">protected</w:t>
+      </w:r>
+      <w:r>
+        <w:rPr>
+          <w:rStyle w:val="NormalTok"/>
+        </w:rPr>
+        <w:t xml:space="preserve"> </w:t>
+      </w:r>
+      <w:r>
+        <w:rPr>
+          <w:rStyle w:val="DataTypeTok"/>
+        </w:rPr>
+        <w:t xml:space="preserve">void</w:t>
+      </w:r>
+      <w:r>
+        <w:rPr>
+          <w:rStyle w:val="NormalTok"/>
+        </w:rPr>
+        <w:t xml:space="preserve"> </w:t>
+      </w:r>
+      <w:r>
+        <w:rPr>
+          <w:rStyle w:val="FunctionTok"/>
+        </w:rPr>
+        <w:t xml:space="preserve">doGet</w:t>
+      </w:r>
+      <w:r>
+        <w:rPr>
+          <w:rStyle w:val="OperatorTok"/>
+        </w:rPr>
+        <w:t xml:space="preserve">(</w:t>
+      </w:r>
+      <w:r>
+        <w:rPr>
+          <w:rStyle w:val="NormalTok"/>
+        </w:rPr>
+        <w:t xml:space="preserve">HttpServletRequest request</w:t>
+      </w:r>
+      <w:r>
+        <w:rPr>
+          <w:rStyle w:val="OperatorTok"/>
+        </w:rPr>
+        <w:t xml:space="preserve">,</w:t>
+      </w:r>
+      <w:r>
+        <w:rPr>
+          <w:rStyle w:val="NormalTok"/>
+        </w:rPr>
+        <w:t xml:space="preserve"> HttpServletResponse response</w:t>
+      </w:r>
+      <w:r>
+        <w:rPr>
+          <w:rStyle w:val="OperatorTok"/>
+        </w:rPr>
+        <w:t xml:space="preserve">)</w:t>
+      </w:r>
+      <w:r>
+        <w:rPr>
+          <w:rStyle w:val="NormalTok"/>
+        </w:rPr>
+        <w:t xml:space="preserve"> </w:t>
+      </w:r>
+      <w:r>
+        <w:rPr>
+          <w:rStyle w:val="KeywordTok"/>
+        </w:rPr>
+        <w:t xml:space="preserve">...</w:t>
+      </w:r>
+      <w:r>
+        <w:rPr>
+          <w:rStyle w:val="NormalTok"/>
+        </w:rPr>
+        <w:t xml:space="preserve"> </w:t>
+      </w:r>
+      <w:r>
+        <w:rPr>
+          <w:rStyle w:val="OperatorTok"/>
+        </w:rPr>
+        <w:t xml:space="preserve">{</w:t>
+      </w:r>
+      <w:r>
+        <w:br/>
+      </w:r>
+      <w:r>
+        <w:rPr>
+          <w:rStyle w:val="NormalTok"/>
+        </w:rPr>
+        <w:t xml:space="preserve">        </w:t>
+      </w:r>
+      <w:r>
+        <w:rPr>
+          <w:rStyle w:val="BuiltInTok"/>
+        </w:rPr>
+        <w:t xml:space="preserve">Long</w:t>
+      </w:r>
+      <w:r>
+        <w:rPr>
+          <w:rStyle w:val="NormalTok"/>
+        </w:rPr>
+        <w:t xml:space="preserve"> id </w:t>
+      </w:r>
+      <w:r>
+        <w:rPr>
+          <w:rStyle w:val="OperatorTok"/>
+        </w:rPr>
+        <w:t xml:space="preserve">=</w:t>
+      </w:r>
+      <w:r>
+        <w:rPr>
+          <w:rStyle w:val="NormalTok"/>
+        </w:rPr>
+        <w:t xml:space="preserve"> Parametros</w:t>
+      </w:r>
+      <w:r>
+        <w:rPr>
+          <w:rStyle w:val="OperatorTok"/>
+        </w:rPr>
+        <w:t xml:space="preserve">.</w:t>
+      </w:r>
+      <w:r>
+        <w:rPr>
+          <w:rStyle w:val="FunctionTok"/>
+        </w:rPr>
+        <w:t xml:space="preserve">id</w:t>
+      </w:r>
+      <w:r>
+        <w:rPr>
+          <w:rStyle w:val="OperatorTok"/>
+        </w:rPr>
+        <w:t xml:space="preserve">(</w:t>
+      </w:r>
+      <w:r>
+        <w:rPr>
+          <w:rStyle w:val="NormalTok"/>
+        </w:rPr>
+        <w:t xml:space="preserve">request</w:t>
+      </w:r>
+      <w:r>
+        <w:rPr>
+          <w:rStyle w:val="OperatorTok"/>
+        </w:rPr>
+        <w:t xml:space="preserve">.</w:t>
+      </w:r>
+      <w:r>
+        <w:rPr>
+          <w:rStyle w:val="FunctionTok"/>
+        </w:rPr>
+        <w:t xml:space="preserve">getPathInfo</w:t>
+      </w:r>
+      <w:r>
+        <w:rPr>
+          <w:rStyle w:val="OperatorTok"/>
+        </w:rPr>
+        <w:t xml:space="preserve">());</w:t>
+      </w:r>
+      <w:r>
+        <w:br/>
+      </w:r>
+      <w:r>
+        <w:rPr>
+          <w:rStyle w:val="NormalTok"/>
+        </w:rPr>
+        <w:t xml:space="preserve">        </w:t>
+      </w:r>
+      <w:r>
+        <w:rPr>
+          <w:rStyle w:val="DataTypeTok"/>
+        </w:rPr>
+        <w:t xml:space="preserve">var</w:t>
+      </w:r>
+      <w:r>
+        <w:rPr>
+          <w:rStyle w:val="NormalTok"/>
+        </w:rPr>
+        <w:t xml:space="preserve"> cliente </w:t>
+      </w:r>
+      <w:r>
+        <w:rPr>
+          <w:rStyle w:val="OperatorTok"/>
+        </w:rPr>
+        <w:t xml:space="preserve">=</w:t>
+      </w:r>
+      <w:r>
+        <w:rPr>
+          <w:rStyle w:val="NormalTok"/>
+        </w:rPr>
+        <w:t xml:space="preserve"> BaseDatos</w:t>
+      </w:r>
+      <w:r>
+        <w:rPr>
+          <w:rStyle w:val="OperatorTok"/>
+        </w:rPr>
+        <w:t xml:space="preserve">.</w:t>
+      </w:r>
+      <w:r>
+        <w:rPr>
+          <w:rStyle w:val="FunctionTok"/>
+        </w:rPr>
+        <w:t xml:space="preserve">consultarUno</w:t>
+      </w:r>
+      <w:r>
+        <w:rPr>
+          <w:rStyle w:val="OperatorTok"/>
+        </w:rPr>
+        <w:t xml:space="preserve">(</w:t>
+      </w:r>
+      <w:r>
+        <w:rPr>
+          <w:rStyle w:val="NormalTok"/>
+        </w:rPr>
+        <w:t xml:space="preserve">Consultas</w:t>
+      </w:r>
+      <w:r>
+        <w:rPr>
+          <w:rStyle w:val="OperatorTok"/>
+        </w:rPr>
+        <w:t xml:space="preserve">.</w:t>
+      </w:r>
+      <w:r>
+        <w:rPr>
+          <w:rStyle w:val="FunctionTok"/>
+        </w:rPr>
+        <w:t xml:space="preserve">SQL_CLIENTE</w:t>
+      </w:r>
+      <w:r>
+        <w:rPr>
+          <w:rStyle w:val="OperatorTok"/>
+        </w:rPr>
+        <w:t xml:space="preserve">,</w:t>
+      </w:r>
+      <w:r>
+        <w:rPr>
+          <w:rStyle w:val="NormalTok"/>
+        </w:rPr>
+        <w:t xml:space="preserve"> id</w:t>
+      </w:r>
+      <w:r>
+        <w:rPr>
+          <w:rStyle w:val="OperatorTok"/>
+        </w:rPr>
+        <w:t xml:space="preserve">);</w:t>
+      </w:r>
+      <w:r>
+        <w:br/>
+      </w:r>
+      <w:r>
+        <w:rPr>
+          <w:rStyle w:val="NormalTok"/>
+        </w:rPr>
+        <w:t xml:space="preserve">        </w:t>
+      </w:r>
+      <w:r>
+        <w:rPr>
+          <w:rStyle w:val="ControlFlowTok"/>
+        </w:rPr>
+        <w:t xml:space="preserve">if</w:t>
+      </w:r>
+      <w:r>
+        <w:rPr>
+          <w:rStyle w:val="NormalTok"/>
+        </w:rPr>
+        <w:t xml:space="preserve"> </w:t>
+      </w:r>
+      <w:r>
+        <w:rPr>
+          <w:rStyle w:val="OperatorTok"/>
+        </w:rPr>
+        <w:t xml:space="preserve">(</w:t>
+      </w:r>
+      <w:r>
+        <w:rPr>
+          <w:rStyle w:val="NormalTok"/>
+        </w:rPr>
+        <w:t xml:space="preserve">cliente </w:t>
+      </w:r>
+      <w:r>
+        <w:rPr>
+          <w:rStyle w:val="OperatorTok"/>
+        </w:rPr>
+        <w:t xml:space="preserve">==</w:t>
+      </w:r>
+      <w:r>
+        <w:rPr>
+          <w:rStyle w:val="NormalTok"/>
+        </w:rPr>
+        <w:t xml:space="preserve"> </w:t>
+      </w:r>
+      <w:r>
+        <w:rPr>
+          <w:rStyle w:val="KeywordTok"/>
+        </w:rPr>
+        <w:t xml:space="preserve">null</w:t>
+      </w:r>
+      <w:r>
+        <w:rPr>
+          <w:rStyle w:val="OperatorTok"/>
+        </w:rPr>
+        <w:t xml:space="preserve">)</w:t>
+      </w:r>
+      <w:r>
+        <w:rPr>
+          <w:rStyle w:val="NormalTok"/>
+        </w:rPr>
+        <w:t xml:space="preserve"> </w:t>
+      </w:r>
+      <w:r>
+        <w:rPr>
+          <w:rStyle w:val="OperatorTok"/>
+        </w:rPr>
+        <w:t xml:space="preserve">{</w:t>
+      </w:r>
+      <w:r>
+        <w:rPr>
+          <w:rStyle w:val="NormalTok"/>
+        </w:rPr>
+        <w:t xml:space="preserve"> response</w:t>
+      </w:r>
+      <w:r>
+        <w:rPr>
+          <w:rStyle w:val="OperatorTok"/>
+        </w:rPr>
+        <w:t xml:space="preserve">.</w:t>
+      </w:r>
+      <w:r>
+        <w:rPr>
+          <w:rStyle w:val="FunctionTok"/>
+        </w:rPr>
+        <w:t xml:space="preserve">sendError</w:t>
+      </w:r>
+      <w:r>
+        <w:rPr>
+          <w:rStyle w:val="OperatorTok"/>
+        </w:rPr>
+        <w:t xml:space="preserve">(</w:t>
+      </w:r>
+      <w:r>
+        <w:rPr>
+          <w:rStyle w:val="DecValTok"/>
+        </w:rPr>
+        <w:t xml:space="preserve">404</w:t>
+      </w:r>
+      <w:r>
+        <w:rPr>
+          <w:rStyle w:val="OperatorTok"/>
+        </w:rPr>
+        <w:t xml:space="preserve">);</w:t>
+      </w:r>
+      <w:r>
+        <w:rPr>
+          <w:rStyle w:val="NormalTok"/>
+        </w:rPr>
+        <w:t xml:space="preserve"> </w:t>
+      </w:r>
+      <w:r>
+        <w:rPr>
+          <w:rStyle w:val="ControlFlowTok"/>
+        </w:rPr>
+        <w:t xml:space="preserve">return</w:t>
+      </w:r>
+      <w:r>
+        <w:rPr>
+          <w:rStyle w:val="OperatorTok"/>
+        </w:rPr>
+        <w:t xml:space="preserve">;</w:t>
+      </w:r>
+      <w:r>
+        <w:rPr>
+          <w:rStyle w:val="NormalTok"/>
+        </w:rPr>
+        <w:t xml:space="preserve"> </w:t>
+      </w:r>
+      <w:r>
+        <w:rPr>
+          <w:rStyle w:val="OperatorTok"/>
+        </w:rPr>
+        <w:t xml:space="preserve">}</w:t>
+      </w:r>
+      <w:r>
+        <w:br/>
+      </w:r>
+      <w:r>
+        <w:rPr>
+          <w:rStyle w:val="NormalTok"/>
+        </w:rPr>
+        <w:t xml:space="preserve">        </w:t>
+      </w:r>
+      <w:r>
+        <w:rPr>
+          <w:rStyle w:val="KeywordTok"/>
+        </w:rPr>
+        <w:t xml:space="preserve">...</w:t>
+      </w:r>
+      <w:r>
+        <w:br/>
+      </w:r>
+      <w:r>
+        <w:rPr>
+          <w:rStyle w:val="NormalTok"/>
+        </w:rPr>
+        <w:t xml:space="preserve">        request</w:t>
+      </w:r>
+      <w:r>
+        <w:rPr>
+          <w:rStyle w:val="OperatorTok"/>
+        </w:rPr>
+        <w:t xml:space="preserve">.</w:t>
+      </w:r>
+      <w:r>
+        <w:rPr>
+          <w:rStyle w:val="FunctionTok"/>
+        </w:rPr>
+        <w:t xml:space="preserve">setAttribute</w:t>
+      </w:r>
+      <w:r>
+        <w:rPr>
+          <w:rStyle w:val="OperatorTok"/>
+        </w:rPr>
+        <w:t xml:space="preserve">(</w:t>
+      </w:r>
+      <w:r>
+        <w:rPr>
+          <w:rStyle w:val="StringTok"/>
+        </w:rPr>
+        <w:t xml:space="preserve">"datos"</w:t>
+      </w:r>
+      <w:r>
+        <w:rPr>
+          <w:rStyle w:val="OperatorTok"/>
+        </w:rPr>
+        <w:t xml:space="preserve">,</w:t>
+      </w:r>
+      <w:r>
+        <w:rPr>
+          <w:rStyle w:val="NormalTok"/>
+        </w:rPr>
+        <w:t xml:space="preserve"> datos</w:t>
+      </w:r>
+      <w:r>
+        <w:rPr>
+          <w:rStyle w:val="OperatorTok"/>
+        </w:rPr>
+        <w:t xml:space="preserve">);</w:t>
+      </w:r>
+      <w:r>
+        <w:br/>
+      </w:r>
+      <w:r>
+        <w:rPr>
+          <w:rStyle w:val="NormalTok"/>
+        </w:rPr>
+        <w:t xml:space="preserve">        request</w:t>
+      </w:r>
+      <w:r>
+        <w:rPr>
+          <w:rStyle w:val="OperatorTok"/>
+        </w:rPr>
+        <w:t xml:space="preserve">.</w:t>
+      </w:r>
+      <w:r>
+        <w:rPr>
+          <w:rStyle w:val="FunctionTok"/>
+        </w:rPr>
+        <w:t xml:space="preserve">getRequestDispatcher</w:t>
+      </w:r>
+      <w:r>
+        <w:rPr>
+          <w:rStyle w:val="OperatorTok"/>
+        </w:rPr>
+        <w:t xml:space="preserve">(</w:t>
+      </w:r>
+      <w:r>
+        <w:rPr>
+          <w:rStyle w:val="StringTok"/>
+        </w:rPr>
+        <w:t xml:space="preserve">"/WEB-INF/jsp/cliente.jsp"</w:t>
+      </w:r>
+      <w:r>
+        <w:rPr>
+          <w:rStyle w:val="OperatorTok"/>
+        </w:rPr>
+        <w:t xml:space="preserve">).</w:t>
+      </w:r>
+      <w:r>
+        <w:rPr>
+          <w:rStyle w:val="FunctionTok"/>
+        </w:rPr>
+        <w:t xml:space="preserve">forward</w:t>
+      </w:r>
+      <w:r>
+        <w:rPr>
+          <w:rStyle w:val="OperatorTok"/>
+        </w:rPr>
+        <w:t xml:space="preserve">(</w:t>
+      </w:r>
+      <w:r>
+        <w:rPr>
+          <w:rStyle w:val="NormalTok"/>
+        </w:rPr>
+        <w:t xml:space="preserve">request</w:t>
+      </w:r>
+      <w:r>
+        <w:rPr>
+          <w:rStyle w:val="OperatorTok"/>
+        </w:rPr>
+        <w:t xml:space="preserve">,</w:t>
+      </w:r>
+      <w:r>
+        <w:rPr>
+          <w:rStyle w:val="NormalTok"/>
+        </w:rPr>
+        <w:t xml:space="preserve"> response</w:t>
+      </w:r>
+      <w:r>
+        <w:rPr>
+          <w:rStyle w:val="OperatorTok"/>
+        </w:rPr>
+        <w:t xml:space="preserve">);</w:t>
       </w:r>
       <w:r>
         <w:br/>
@@ -2494,7 +3414,7 @@
         <w:rPr>
           <w:lang w:val="es-CO"/>
         </w:rPr>
-        <w:t xml:space="preserve">dueño), y el servicio los lee de ahí.</w:t>
+        <w:t xml:space="preserve">dueño), y el servicio de Tomcat los lee de ahí.</w:t>
       </w:r>
     </w:p>
     <w:p>
@@ -2717,6 +3637,60 @@
           <w:bCs/>
           <w:lang w:val="es-CO"/>
         </w:rPr>
+        <w:t xml:space="preserve">Escape en las páginas:</w:t>
+      </w:r>
+      <w:r>
+        <w:rPr>
+          <w:lang w:val="es-CO"/>
+        </w:rPr>
+        <w:t xml:space="preserve"> </w:t>
+      </w:r>
+      <w:r>
+        <w:rPr>
+          <w:lang w:val="es-CO"/>
+        </w:rPr>
+        <w:t xml:space="preserve">los textos que vienen de la base se muestran con</w:t>
+      </w:r>
+      <w:r>
+        <w:rPr>
+          <w:lang w:val="es-CO"/>
+        </w:rPr>
+        <w:t xml:space="preserve"> </w:t>
+      </w:r>
+      <w:r>
+        <w:rPr>
+          <w:rStyle w:val="VerbatimChar"/>
+          <w:lang w:val="es-CO"/>
+        </w:rPr>
+        <w:t xml:space="preserve">&lt;c:out&gt;</w:t>
+      </w:r>
+      <w:r>
+        <w:rPr>
+          <w:lang w:val="es-CO"/>
+        </w:rPr>
+        <w:t xml:space="preserve"> </w:t>
+      </w:r>
+      <w:r>
+        <w:rPr>
+          <w:lang w:val="es-CO"/>
+        </w:rPr>
+        <w:t xml:space="preserve">de JSTL, que escapa el HTML.</w:t>
+      </w:r>
+    </w:p>
+    <w:p>
+      <w:pPr>
+        <w:pStyle w:val="Compact"/>
+        <w:numPr>
+          <w:ilvl w:val="0"/>
+          <w:numId w:val="1001"/>
+        </w:numPr>
+      </w:pPr>
+      <w:r>
+        <w:rPr>
+          <w:b/>
+          <w:bCs/>
+          <w:lang w:val="es-CO"/>
+        </w:rPr>
         <w:t xml:space="preserve">Álgebra relacional:</w:t>
       </w:r>
       <w:r>
@@ -2798,7 +3772,7 @@
         <w:rPr>
           <w:rStyle w:val="CommentTok"/>
         </w:rPr>
-        <w:t xml:space="preserve"># instala Java 21, compila con Maven y deja el servicio sigevet-web activo</w:t>
+        <w:t xml:space="preserve"># instala Java 21 y Tomcat 10.1, compila ROOT.war y deja el servicio activo</w:t>
       </w:r>
       <w:r>
         <w:br/>
@@ -2824,7 +3798,7 @@
         <w:rPr>
           <w:lang w:val="es-CO"/>
         </w:rPr>
-        <w:t xml:space="preserve">En cualquier equipo con Java 21:</w:t>
+        <w:t xml:space="preserve">En cualquier equipo con Java 21 y Tomcat 10.1:</w:t>
       </w:r>
     </w:p>
     <w:p>
@@ -2848,6 +3822,66 @@
       </w:r>
       <w:r>
         <w:rPr>
+          <w:rStyle w:val="ExtensionTok"/>
+        </w:rPr>
+        <w:t xml:space="preserve">./mvnw</w:t>
+      </w:r>
+      <w:r>
+        <w:rPr>
+          <w:rStyle w:val="NormalTok"/>
+        </w:rPr>
+        <w:t xml:space="preserve"> package                            </w:t>
+      </w:r>
+      <w:r>
+        <w:rPr>
+          <w:rStyle w:val="CommentTok"/>
+        </w:rPr>
+        <w:t xml:space="preserve"># genera target/ROOT.war</w:t>
+      </w:r>
+      <w:r>
+        <w:br/>
+      </w:r>
+      <w:r>
+        <w:rPr>
+          <w:rStyle w:val="FunctionTok"/>
+        </w:rPr>
+        <w:t xml:space="preserve">cp</w:t>
+      </w:r>
+      <w:r>
+        <w:rPr>
+          <w:rStyle w:val="NormalTok"/>
+        </w:rPr>
+        <w:t xml:space="preserve"> target/ROOT.war </w:t>
+      </w:r>
+      <w:r>
+        <w:rPr>
+          <w:rStyle w:val="OperatorTok"/>
+        </w:rPr>
+        <w:t xml:space="preserve">&lt;</w:t>
+      </w:r>
+      <w:r>
+        <w:rPr>
+          <w:rStyle w:val="NormalTok"/>
+        </w:rPr>
+        <w:t xml:space="preserve">tomcat</w:t>
+      </w:r>
+      <w:r>
+        <w:rPr>
+          <w:rStyle w:val="OperatorTok"/>
+        </w:rPr>
+        <w:t xml:space="preserve">&gt;</w:t>
+      </w:r>
+      <w:r>
+        <w:rPr>
+          <w:rStyle w:val="NormalTok"/>
+        </w:rPr>
+        <w:t xml:space="preserve">/webapps/</w:t>
+      </w:r>
+      <w:r>
+        <w:br/>
+      </w:r>
+      <w:r>
+        <w:rPr>
           <w:rStyle w:val="BuiltInTok"/>
         </w:rPr>
         <w:t xml:space="preserve">export</w:t>
@@ -2881,48 +3915,45 @@
       </w:r>
       <w:r>
         <w:rPr>
+          <w:rStyle w:val="OperatorTok"/>
+        </w:rPr>
+        <w:t xml:space="preserve">&lt;</w:t>
+      </w:r>
+      <w:r>
+        <w:rPr>
+          <w:rStyle w:val="NormalTok"/>
+        </w:rPr>
+        <w:t xml:space="preserve">tomcat</w:t>
+      </w:r>
+      <w:r>
+        <w:rPr>
+          <w:rStyle w:val="OperatorTok"/>
+        </w:rPr>
+        <w:t xml:space="preserve">&gt;</w:t>
+      </w:r>
+      <w:r>
+        <w:rPr>
+          <w:rStyle w:val="NormalTok"/>
+        </w:rPr>
+        <w:t xml:space="preserve">/bin/catalina.sh </w:t>
+      </w:r>
+      <w:r>
+        <w:rPr>
           <w:rStyle w:val="ExtensionTok"/>
         </w:rPr>
-        <w:t xml:space="preserve">./mvnw</w:t>
-      </w:r>
-      <w:r>
-        <w:rPr>
-          <w:rStyle w:val="NormalTok"/>
-        </w:rPr>
-        <w:t xml:space="preserve"> package</w:t>
-      </w:r>
-      <w:r>
-        <w:br/>
-      </w:r>
-      <w:r>
-        <w:rPr>
-          <w:rStyle w:val="ExtensionTok"/>
-        </w:rPr>
-        <w:t xml:space="preserve">java</w:t>
-      </w:r>
-      <w:r>
-        <w:rPr>
-          <w:rStyle w:val="NormalTok"/>
-        </w:rPr>
-        <w:t xml:space="preserve"> </w:t>
-      </w:r>
-      <w:r>
-        <w:rPr>
-          <w:rStyle w:val="AttributeTok"/>
-        </w:rPr>
-        <w:t xml:space="preserve">-jar</w:t>
-      </w:r>
-      <w:r>
-        <w:rPr>
-          <w:rStyle w:val="NormalTok"/>
-        </w:rPr>
-        <w:t xml:space="preserve"> target/sigevet-0.0.1-SNAPSHOT.jar      </w:t>
+        <w:t xml:space="preserve">run</w:t>
+      </w:r>
+      <w:r>
+        <w:rPr>
+          <w:rStyle w:val="NormalTok"/>
+        </w:rPr>
+        <w:t xml:space="preserve">              </w:t>
       </w:r>
       <w:r>
         <w:rPr>
           <w:rStyle w:val="CommentTok"/>
         </w:rPr>
-        <w:t xml:space="preserve"># http://localhost:5000</w:t>
+        <w:t xml:space="preserve"># http://localhost:8080</w:t>
       </w:r>
     </w:p>
     <w:p>
@@ -2956,7 +3987,7 @@
         <w:rPr>
           <w:lang w:val="es-CO"/>
         </w:rPr>
-        <w:t xml:space="preserve">La aplicación Java (Spring Boot) se ejecutó como servicio dentro de la VM, conectada a Oracle con el usuario</w:t>
+        <w:t xml:space="preserve">La aplicación Java (Servlets + JSP en Tomcat) se ejecutó como servicio dentro de la VM, conectada a Oracle con el usuario</w:t>
       </w:r>
       <w:r>
         <w:rPr>
@@ -3653,7 +4684,7 @@
               <a:graphicData uri="http://schemas.openxmlformats.org/drawingml/2006/picture">
                 <pic:pic>
                   <pic:nvPicPr>
-                    <pic:cNvPr descr="diagramas/png/app_inicio_185230-20Oct2026.png" id="27" name="Picture"/>
+                    <pic:cNvPr descr="diagramas/png/app_inicio_191506-20Oct2026.png" id="27" name="Picture"/>
                     <pic:cNvPicPr>
                       <a:picLocks noChangeArrowheads="1" noChangeAspect="1"/>
                     </pic:cNvPicPr>
@@ -3711,7 +4742,7 @@
               <a:graphicData uri="http://schemas.openxmlformats.org/drawingml/2006/picture">
                 <pic:pic>
                   <pic:nvPicPr>
-                    <pic:cNvPr descr="diagramas/png/app_cliente_185230-20Oct2026.png" id="30" name="Picture"/>
+                    <pic:cNvPr descr="diagramas/png/app_cliente_191506-20Oct2026.png" id="30" name="Picture"/>
                     <pic:cNvPicPr>
                       <a:picLocks noChangeArrowheads="1" noChangeAspect="1"/>
                     </pic:cNvPicPr>
@@ -3769,7 +4800,7 @@
               <a:graphicData uri="http://schemas.openxmlformats.org/drawingml/2006/picture">
                 <pic:pic>
                   <pic:nvPicPr>
-                    <pic:cNvPr descr="diagramas/png/app_mascota_185230-20Oct2026.png" id="33" name="Picture"/>
+                    <pic:cNvPr descr="diagramas/png/app_mascota_191506-20Oct2026.png" id="33" name="Picture"/>
                     <pic:cNvPicPr>
                       <a:picLocks noChangeArrowheads="1" noChangeAspect="1"/>
                     </pic:cNvPicPr>
@@ -3827,7 +4858,7 @@
               <a:graphicData uri="http://schemas.openxmlformats.org/drawingml/2006/picture">
                 <pic:pic>
                   <pic:nvPicPr>
-                    <pic:cNvPr descr="diagramas/png/app_agenda_185230-20Oct2026.png" id="36" name="Picture"/>
+                    <pic:cNvPr descr="diagramas/png/app_agenda_191506-20Oct2026.png" id="36" name="Picture"/>
                     <pic:cNvPicPr>
                       <a:picLocks noChangeArrowheads="1" noChangeAspect="1"/>
                     </pic:cNvPicPr>
@@ -3885,7 +4916,7 @@
               <a:graphicData uri="http://schemas.openxmlformats.org/drawingml/2006/picture">
                 <pic:pic>
                   <pic:nvPicPr>
-                    <pic:cNvPr descr="diagramas/png/app_inventario_185230-20Oct2026.png" id="39" name="Picture"/>
+                    <pic:cNvPr descr="diagramas/png/app_inventario_191506-20Oct2026.png" id="39" name="Picture"/>
                     <pic:cNvPicPr>
                       <a:picLocks noChangeArrowheads="1" noChangeAspect="1"/>
                     </pic:cNvPicPr>
@@ -3943,7 +4974,7 @@
               <a:graphicData uri="http://schemas.openxmlformats.org/drawingml/2006/picture">
                 <pic:pic>
                   <pic:nvPicPr>
-                    <pic:cNvPr descr="diagramas/png/app_factura_185230-20Oct2026.png" id="42" name="Picture"/>
+                    <pic:cNvPr descr="diagramas/png/app_factura_191506-20Oct2026.png" id="42" name="Picture"/>
                     <pic:cNvPicPr>
                       <a:picLocks noChangeArrowheads="1" noChangeAspect="1"/>
                     </pic:cNvPicPr>
@@ -4001,7 +5032,7 @@
               <a:graphicData uri="http://schemas.openxmlformats.org/drawingml/2006/picture">
                 <pic:pic>
                   <pic:nvPicPr>
-                    <pic:cNvPr descr="diagramas/png/app_personal_185230-20Oct2026.png" id="45" name="Picture"/>
+                    <pic:cNvPr descr="diagramas/png/app_personal_191506-20Oct2026.png" id="45" name="Picture"/>
                     <pic:cNvPicPr>
                       <a:picLocks noChangeArrowheads="1" noChangeAspect="1"/>
                     </pic:cNvPicPr>
@@ -4059,7 +5090,7 @@
               <a:graphicData uri="http://schemas.openxmlformats.org/drawingml/2006/picture">
                 <pic:pic>
                   <pic:nvPicPr>
-                    <pic:cNvPr descr="diagramas/png/app_algebra_185230-20Oct2026.png" id="48" name="Picture"/>
+                    <pic:cNvPr descr="diagramas/png/app_algebra_191506-20Oct2026.png" id="48" name="Picture"/>
                     <pic:cNvPicPr>
                       <a:picLocks noChangeArrowheads="1" noChangeAspect="1"/>
                     </pic:cNvPicPr>

</xml_diff>

<commit_message>
docs: update server data, video script and web app chapter
- 01, 02 and 08: server is now the Fedora 44 laptop (Ryzen 3 3250U, 17 GiB,
  192.168.2.40) running the Lima VM with Oracle Linux 9 and MySQL 8.4.
- 08: four-person split (blocks 5 and 6 go to Sergio) and block 3 shows the
  Draw.io models, as in GUION_VIDEO.md.
- 06: web app chapter follows the new layered MVC structure (controller,
  service, dto, exception, connection) with the real controller and service code.
- 00: same changes mirrored in the final document.
</commit_message>
<xml_diff>
--- a/documentos/fase2/06_Conexion_Aplicacion_Web.docx
+++ b/documentos/fase2/06_Conexion_Aplicacion_Web.docx
@@ -418,7 +418,7 @@
           <w:rStyle w:val="VerbatimChar"/>
           <w:lang w:val="es-CO"/>
         </w:rPr>
-        <w:t xml:space="preserve">@GetMapping</w:t>
+        <w:t>@Service</w:t>
       </w:r>
       <w:r>
         <w:rPr>
@@ -437,13 +437,13 @@
           <w:rStyle w:val="VerbatimChar"/>
           <w:lang w:val="es-CO"/>
         </w:rPr>
-        <w:t xml:space="preserve">@Autowired</w:t>
-      </w:r>
-      <w:r>
-        <w:rPr>
-          <w:lang w:val="es-CO"/>
-        </w:rPr>
-        <w:t xml:space="preserve"> </w:t>
+        <w:t>@GetMapping</w:t>
+      </w:r>
+      <w:r>
+        <w:rPr>
+          <w:lang w:val="es-CO"/>
+        </w:rPr>
+        <w:t xml:space="preserve">, inyección por constructor </w:t>
       </w:r>
       <w:r>
         <w:rPr>
@@ -469,7 +469,7 @@
         <w:rPr>
           <w:lang w:val="es-CO"/>
         </w:rPr>
-        <w:t xml:space="preserve">. El archivo</w:t>
+        <w:t>. El código sigue el patrón Modelo-Vista-Controlador, dividido en capas: el controlador recibe la petición, el servicio reúne los datos y el DAO consulta MySQL. El archivo</w:t>
       </w:r>
       <w:r>
         <w:rPr>
@@ -525,7 +525,7 @@
           <w:rStyle w:val="VerbatimChar"/>
           <w:lang w:val="es-CO"/>
         </w:rPr>
-        <w:t xml:space="preserve">Navegador ──HTTP 5000──▶ Controlador (@GetMapping) ──▶ DAO (SQL escrito a mano)</w:t>
+        <w:t xml:space="preserve">Navegador ─HTTP 5000─▶ Controller ─▶ Service ─▶ DAO (JDBC)</w:t>
       </w:r>
       <w:r>
         <w:br/>
@@ -535,7 +535,7 @@
           <w:rStyle w:val="VerbatimChar"/>
           <w:lang w:val="es-CO"/>
         </w:rPr>
-        <w:t xml:space="preserve">                               │                          │ JDBC: DriverManager + PreparedStatement</w:t>
+        <w:t xml:space="preserve">                           │                    │</w:t>
       </w:r>
       <w:r>
         <w:br/>
@@ -545,7 +545,7 @@
           <w:rStyle w:val="VerbatimChar"/>
           <w:lang w:val="es-CO"/>
         </w:rPr>
-        <w:t xml:space="preserve">                               ▼                          ▼</w:t>
+        <w:t xml:space="preserve">                           ▼                    ▼</w:t>
       </w:r>
       <w:r>
         <w:br/>
@@ -555,7 +555,7 @@
           <w:rStyle w:val="VerbatimChar"/>
           <w:lang w:val="es-CO"/>
         </w:rPr>
-        <w:t xml:space="preserve">                      Plantilla HTML (Thymeleaf)    MySQL 8.4 · base sigevet (usuario vet_app)</w:t>
+        <w:t xml:space="preserve">              Plantilla HTML (Thymeleaf)        MySQL 8.4, base sigevet</w:t>
       </w:r>
     </w:p>
     <w:p>
@@ -648,6 +648,9 @@
         </w:tc>
       </w:tr>
       <w:tr>
+        <w:trPr>
+          <w:cantSplit/>
+        </w:trPr>
         <w:tc>
           <w:tcPr/>
           <w:p>
@@ -660,7 +663,7 @@
                 <w:sz w:val="19"/>
                 <w:lang w:val="es-CO"/>
               </w:rPr>
-              <w:t xml:space="preserve">conexion/ConexionBD.java</w:t>
+              <w:t>connection/ConexionBD.java</w:t>
             </w:r>
           </w:p>
         </w:tc>
@@ -675,14 +678,13 @@
                 <w:sz w:val="19"/>
                 <w:lang w:val="es-CO"/>
               </w:rPr>
-              <w:t xml:space="preserve">Abre la conexión con</w:t>
-            </w:r>
-            <w:r>
-              <w:rPr>
-                <w:sz w:val="19"/>
-                <w:lang w:val="es-CO"/>
-              </w:rPr>
-              <w:t xml:space="preserve"> </w:t>
+              <w:t>Abre la conexión con DriverManager; la URL, el usuario y la clave salen de application.properties</w:t>
+            </w:r>
+            <w:r>
+              <w:rPr>
+                <w:sz w:val="19"/>
+                <w:lang w:val="es-CO"/>
+              </w:rPr>
             </w:r>
             <w:r>
               <w:rPr>
@@ -690,21 +692,18 @@
                 <w:sz w:val="19"/>
                 <w:lang w:val="es-CO"/>
               </w:rPr>
-              <w:t xml:space="preserve">DriverManager</w:t>
-            </w:r>
-            <w:r>
-              <w:rPr>
-                <w:sz w:val="19"/>
-                <w:lang w:val="es-CO"/>
-              </w:rPr>
-              <w:t xml:space="preserve">; la URL, el usuario y la clave salen de</w:t>
-            </w:r>
-            <w:r>
-              <w:rPr>
-                <w:sz w:val="19"/>
-                <w:lang w:val="es-CO"/>
-              </w:rPr>
-              <w:t xml:space="preserve"> </w:t>
+            </w:r>
+            <w:r>
+              <w:rPr>
+                <w:sz w:val="19"/>
+                <w:lang w:val="es-CO"/>
+              </w:rPr>
+            </w:r>
+            <w:r>
+              <w:rPr>
+                <w:sz w:val="19"/>
+                <w:lang w:val="es-CO"/>
+              </w:rPr>
             </w:r>
             <w:r>
               <w:rPr>
@@ -712,12 +711,14 @@
                 <w:sz w:val="19"/>
                 <w:lang w:val="es-CO"/>
               </w:rPr>
-              <w:t xml:space="preserve">application.properties</w:t>
             </w:r>
           </w:p>
         </w:tc>
       </w:tr>
       <w:tr>
+        <w:trPr>
+          <w:cantSplit/>
+        </w:trPr>
         <w:tc>
           <w:tcPr/>
           <w:p>
@@ -730,7 +731,7 @@
                 <w:sz w:val="19"/>
                 <w:lang w:val="es-CO"/>
               </w:rPr>
-              <w:t xml:space="preserve">modelo/</w:t>
+              <w:t>model/</w:t>
             </w:r>
           </w:p>
         </w:tc>
@@ -745,14 +746,13 @@
                 <w:sz w:val="19"/>
                 <w:lang w:val="es-CO"/>
               </w:rPr>
-              <w:t xml:space="preserve">Clases con atributos privados, getters y setters:</w:t>
-            </w:r>
-            <w:r>
-              <w:rPr>
-                <w:sz w:val="19"/>
-                <w:lang w:val="es-CO"/>
-              </w:rPr>
-              <w:t xml:space="preserve"> </w:t>
+              <w:t>Clases con atributos privados, constructor vacío y con parámetros, getters, setters, equals, hashCode y toString: Persona, Cliente, Empleado, Veterinario, Auxiliar, Mascota, Cita, Factura, etc., y los enums EstadoCita y EstadoFactura</w:t>
+            </w:r>
+            <w:r>
+              <w:rPr>
+                <w:sz w:val="19"/>
+                <w:lang w:val="es-CO"/>
+              </w:rPr>
             </w:r>
             <w:r>
               <w:rPr>
@@ -760,21 +760,18 @@
                 <w:sz w:val="19"/>
                 <w:lang w:val="es-CO"/>
               </w:rPr>
-              <w:t xml:space="preserve">Persona</w:t>
-            </w:r>
-            <w:r>
-              <w:rPr>
-                <w:sz w:val="19"/>
-                <w:lang w:val="es-CO"/>
-              </w:rPr>
-              <w:t xml:space="preserve">,</w:t>
-            </w:r>
-            <w:r>
-              <w:rPr>
-                <w:sz w:val="19"/>
-                <w:lang w:val="es-CO"/>
-              </w:rPr>
-              <w:t xml:space="preserve"> </w:t>
+            </w:r>
+            <w:r>
+              <w:rPr>
+                <w:sz w:val="19"/>
+                <w:lang w:val="es-CO"/>
+              </w:rPr>
+            </w:r>
+            <w:r>
+              <w:rPr>
+                <w:sz w:val="19"/>
+                <w:lang w:val="es-CO"/>
+              </w:rPr>
             </w:r>
             <w:r>
               <w:rPr>
@@ -782,151 +779,14 @@
                 <w:sz w:val="19"/>
                 <w:lang w:val="es-CO"/>
               </w:rPr>
-              <w:t xml:space="preserve">Cliente</w:t>
-            </w:r>
-            <w:r>
-              <w:rPr>
-                <w:sz w:val="19"/>
-                <w:lang w:val="es-CO"/>
-              </w:rPr>
-              <w:t xml:space="preserve">,</w:t>
-            </w:r>
-            <w:r>
-              <w:rPr>
-                <w:sz w:val="19"/>
-                <w:lang w:val="es-CO"/>
-              </w:rPr>
-              <w:t xml:space="preserve"> </w:t>
-            </w:r>
-            <w:r>
-              <w:rPr>
-                <w:rStyle w:val="VerbatimChar"/>
-                <w:sz w:val="19"/>
-                <w:lang w:val="es-CO"/>
-              </w:rPr>
-              <w:t xml:space="preserve">Empleado</w:t>
-            </w:r>
-            <w:r>
-              <w:rPr>
-                <w:sz w:val="19"/>
-                <w:lang w:val="es-CO"/>
-              </w:rPr>
-              <w:t xml:space="preserve">,</w:t>
-            </w:r>
-            <w:r>
-              <w:rPr>
-                <w:sz w:val="19"/>
-                <w:lang w:val="es-CO"/>
-              </w:rPr>
-              <w:t xml:space="preserve"> </w:t>
-            </w:r>
-            <w:r>
-              <w:rPr>
-                <w:rStyle w:val="VerbatimChar"/>
-                <w:sz w:val="19"/>
-                <w:lang w:val="es-CO"/>
-              </w:rPr>
-              <w:t xml:space="preserve">Veterinario</w:t>
-            </w:r>
-            <w:r>
-              <w:rPr>
-                <w:sz w:val="19"/>
-                <w:lang w:val="es-CO"/>
-              </w:rPr>
-              <w:t xml:space="preserve">,</w:t>
-            </w:r>
-            <w:r>
-              <w:rPr>
-                <w:sz w:val="19"/>
-                <w:lang w:val="es-CO"/>
-              </w:rPr>
-              <w:t xml:space="preserve"> </w:t>
-            </w:r>
-            <w:r>
-              <w:rPr>
-                <w:rStyle w:val="VerbatimChar"/>
-                <w:sz w:val="19"/>
-                <w:lang w:val="es-CO"/>
-              </w:rPr>
-              <w:t xml:space="preserve">Auxiliar</w:t>
-            </w:r>
-            <w:r>
-              <w:rPr>
-                <w:sz w:val="19"/>
-                <w:lang w:val="es-CO"/>
-              </w:rPr>
-              <w:t xml:space="preserve">,</w:t>
-            </w:r>
-            <w:r>
-              <w:rPr>
-                <w:sz w:val="19"/>
-                <w:lang w:val="es-CO"/>
-              </w:rPr>
-              <w:t xml:space="preserve"> </w:t>
-            </w:r>
-            <w:r>
-              <w:rPr>
-                <w:rStyle w:val="VerbatimChar"/>
-                <w:sz w:val="19"/>
-                <w:lang w:val="es-CO"/>
-              </w:rPr>
-              <w:t xml:space="preserve">Mascota</w:t>
-            </w:r>
-            <w:r>
-              <w:rPr>
-                <w:sz w:val="19"/>
-                <w:lang w:val="es-CO"/>
-              </w:rPr>
-              <w:t xml:space="preserve">,</w:t>
-            </w:r>
-            <w:r>
-              <w:rPr>
-                <w:sz w:val="19"/>
-                <w:lang w:val="es-CO"/>
-              </w:rPr>
-              <w:t xml:space="preserve"> </w:t>
-            </w:r>
-            <w:r>
-              <w:rPr>
-                <w:rStyle w:val="VerbatimChar"/>
-                <w:sz w:val="19"/>
-                <w:lang w:val="es-CO"/>
-              </w:rPr>
-              <w:t xml:space="preserve">Cita</w:t>
-            </w:r>
-            <w:r>
-              <w:rPr>
-                <w:sz w:val="19"/>
-                <w:lang w:val="es-CO"/>
-              </w:rPr>
-              <w:t xml:space="preserve">,</w:t>
-            </w:r>
-            <w:r>
-              <w:rPr>
-                <w:sz w:val="19"/>
-                <w:lang w:val="es-CO"/>
-              </w:rPr>
-              <w:t xml:space="preserve"> </w:t>
-            </w:r>
-            <w:r>
-              <w:rPr>
-                <w:rStyle w:val="VerbatimChar"/>
-                <w:sz w:val="19"/>
-                <w:lang w:val="es-CO"/>
-              </w:rPr>
-              <w:t xml:space="preserve">Factura</w:t>
-            </w:r>
-            <w:r>
-              <w:rPr>
-                <w:sz w:val="19"/>
-                <w:lang w:val="es-CO"/>
-              </w:rPr>
-              <w:t xml:space="preserve">, etc.</w:t>
             </w:r>
           </w:p>
         </w:tc>
       </w:tr>
       <w:tr>
+        <w:trPr>
+          <w:cantSplit/>
+        </w:trPr>
         <w:tc>
           <w:tcPr/>
           <w:p>
@@ -939,7 +799,7 @@
                 <w:sz w:val="19"/>
                 <w:lang w:val="es-CO"/>
               </w:rPr>
-              <w:t xml:space="preserve">dao/</w:t>
+              <w:t>dto/</w:t>
             </w:r>
           </w:p>
         </w:tc>
@@ -954,7 +814,13 @@
                 <w:sz w:val="19"/>
                 <w:lang w:val="es-CO"/>
               </w:rPr>
-              <w:t xml:space="preserve">Una clase por tema (</w:t>
+              <w:t>ClienteDetalleDTO, MascotaDetalleDTO, FacturaDetalleDTO y EjercicioDetalleDTO: agrupan los datos que necesita cada página</w:t>
+            </w:r>
+            <w:r>
+              <w:rPr>
+                <w:sz w:val="19"/>
+                <w:lang w:val="es-CO"/>
+              </w:rPr>
             </w:r>
             <w:r>
               <w:rPr>
@@ -962,21 +828,18 @@
                 <w:sz w:val="19"/>
                 <w:lang w:val="es-CO"/>
               </w:rPr>
-              <w:t xml:space="preserve">ClienteDAO</w:t>
-            </w:r>
-            <w:r>
-              <w:rPr>
-                <w:sz w:val="19"/>
-                <w:lang w:val="es-CO"/>
-              </w:rPr>
-              <w:t xml:space="preserve">,</w:t>
-            </w:r>
-            <w:r>
-              <w:rPr>
-                <w:sz w:val="19"/>
-                <w:lang w:val="es-CO"/>
-              </w:rPr>
-              <w:t xml:space="preserve"> </w:t>
+            </w:r>
+            <w:r>
+              <w:rPr>
+                <w:sz w:val="19"/>
+                <w:lang w:val="es-CO"/>
+              </w:rPr>
+            </w:r>
+            <w:r>
+              <w:rPr>
+                <w:sz w:val="19"/>
+                <w:lang w:val="es-CO"/>
+              </w:rPr>
             </w:r>
             <w:r>
               <w:rPr>
@@ -984,63 +847,14 @@
                 <w:sz w:val="19"/>
                 <w:lang w:val="es-CO"/>
               </w:rPr>
-              <w:t xml:space="preserve">MascotaDAO</w:t>
-            </w:r>
-            <w:r>
-              <w:rPr>
-                <w:sz w:val="19"/>
-                <w:lang w:val="es-CO"/>
-              </w:rPr>
-              <w:t xml:space="preserve">,</w:t>
-            </w:r>
-            <w:r>
-              <w:rPr>
-                <w:sz w:val="19"/>
-                <w:lang w:val="es-CO"/>
-              </w:rPr>
-              <w:t xml:space="preserve"> </w:t>
-            </w:r>
-            <w:r>
-              <w:rPr>
-                <w:rStyle w:val="VerbatimChar"/>
-                <w:sz w:val="19"/>
-                <w:lang w:val="es-CO"/>
-              </w:rPr>
-              <w:t xml:space="preserve">FacturaDAO</w:t>
-            </w:r>
-            <w:r>
-              <w:rPr>
-                <w:sz w:val="19"/>
-                <w:lang w:val="es-CO"/>
-              </w:rPr>
-              <w:t xml:space="preserve">,</w:t>
-            </w:r>
-            <w:r>
-              <w:rPr>
-                <w:sz w:val="19"/>
-                <w:lang w:val="es-CO"/>
-              </w:rPr>
-              <w:t xml:space="preserve"> </w:t>
-            </w:r>
-            <w:r>
-              <w:rPr>
-                <w:rStyle w:val="VerbatimChar"/>
-                <w:sz w:val="19"/>
-                <w:lang w:val="es-CO"/>
-              </w:rPr>
-              <w:t xml:space="preserve">PersonalDAO</w:t>
-            </w:r>
-            <w:r>
-              <w:rPr>
-                <w:sz w:val="19"/>
-                <w:lang w:val="es-CO"/>
-              </w:rPr>
-              <w:t xml:space="preserve">…) con el SQL de cada consulta</w:t>
             </w:r>
           </w:p>
         </w:tc>
       </w:tr>
       <w:tr>
+        <w:trPr>
+          <w:cantSplit/>
+        </w:trPr>
         <w:tc>
           <w:tcPr/>
           <w:p>
@@ -1053,7 +867,7 @@
                 <w:sz w:val="19"/>
                 <w:lang w:val="es-CO"/>
               </w:rPr>
-              <w:t xml:space="preserve">controlador/</w:t>
+              <w:t>dao/</w:t>
             </w:r>
           </w:p>
         </w:tc>
@@ -1068,12 +882,47 @@
                 <w:sz w:val="19"/>
                 <w:lang w:val="es-CO"/>
               </w:rPr>
-              <w:t xml:space="preserve">Un controlador por página: inicio, clientes, mascotas, agenda, inventario, facturas, personal y álgebra</w:t>
+              <w:t>Una clase por tema (ClienteDAO, MascotaDAO, FacturaDAO, PersonalDAO…) con el SQL de cada consulta</w:t>
+            </w:r>
+            <w:r>
+              <w:rPr>
+                <w:sz w:val="19"/>
+                <w:lang w:val="es-CO"/>
+              </w:rPr>
+            </w:r>
+            <w:r>
+              <w:rPr>
+                <w:rStyle w:val="VerbatimChar"/>
+                <w:sz w:val="19"/>
+                <w:lang w:val="es-CO"/>
+              </w:rPr>
+            </w:r>
+            <w:r>
+              <w:rPr>
+                <w:sz w:val="19"/>
+                <w:lang w:val="es-CO"/>
+              </w:rPr>
+            </w:r>
+            <w:r>
+              <w:rPr>
+                <w:sz w:val="19"/>
+                <w:lang w:val="es-CO"/>
+              </w:rPr>
+            </w:r>
+            <w:r>
+              <w:rPr>
+                <w:rStyle w:val="VerbatimChar"/>
+                <w:sz w:val="19"/>
+                <w:lang w:val="es-CO"/>
+              </w:rPr>
             </w:r>
           </w:p>
         </w:tc>
       </w:tr>
       <w:tr>
+        <w:trPr>
+          <w:cantSplit/>
+        </w:trPr>
         <w:tc>
           <w:tcPr/>
           <w:p>
@@ -1086,7 +935,7 @@
                 <w:sz w:val="19"/>
                 <w:lang w:val="es-CO"/>
               </w:rPr>
-              <w:t xml:space="preserve">algebra/LectorAlgebra.java</w:t>
+              <w:t>service/</w:t>
             </w:r>
           </w:p>
         </w:tc>
@@ -1101,14 +950,13 @@
                 <w:sz w:val="19"/>
                 <w:lang w:val="es-CO"/>
               </w:rPr>
-              <w:t xml:space="preserve">Lee los 55 ejercicios del script</w:t>
-            </w:r>
-            <w:r>
-              <w:rPr>
-                <w:sz w:val="19"/>
-                <w:lang w:val="es-CO"/>
-              </w:rPr>
-              <w:t xml:space="preserve"> </w:t>
+              <w:t>Una clase …Service por tema (ClienteService, MascotaService, FacturaService…): reúne los datos de varios DAO y entrega el DTO de la página</w:t>
+            </w:r>
+            <w:r>
+              <w:rPr>
+                <w:sz w:val="19"/>
+                <w:lang w:val="es-CO"/>
+              </w:rPr>
             </w:r>
             <w:r>
               <w:rPr>
@@ -1116,26 +964,33 @@
                 <w:sz w:val="19"/>
                 <w:lang w:val="es-CO"/>
               </w:rPr>
-              <w:t xml:space="preserve">01_consultas_algebra_relacional.sql</w:t>
-            </w:r>
-            <w:r>
-              <w:rPr>
-                <w:sz w:val="19"/>
-                <w:lang w:val="es-CO"/>
-              </w:rPr>
-              <w:t xml:space="preserve"> </w:t>
-            </w:r>
-            <w:r>
-              <w:rPr>
-                <w:sz w:val="19"/>
-                <w:lang w:val="es-CO"/>
-              </w:rPr>
-              <w:t xml:space="preserve">línea por línea</w:t>
+            </w:r>
+            <w:r>
+              <w:rPr>
+                <w:sz w:val="19"/>
+                <w:lang w:val="es-CO"/>
+              </w:rPr>
+            </w:r>
+            <w:r>
+              <w:rPr>
+                <w:sz w:val="19"/>
+                <w:lang w:val="es-CO"/>
+              </w:rPr>
+            </w:r>
+            <w:r>
+              <w:rPr>
+                <w:rStyle w:val="VerbatimChar"/>
+                <w:sz w:val="19"/>
+                <w:lang w:val="es-CO"/>
+              </w:rPr>
             </w:r>
           </w:p>
         </w:tc>
       </w:tr>
       <w:tr>
+        <w:trPr>
+          <w:cantSplit/>
+        </w:trPr>
         <w:tc>
           <w:tcPr/>
           <w:p>
@@ -1148,7 +1003,7 @@
                 <w:sz w:val="19"/>
                 <w:lang w:val="es-CO"/>
               </w:rPr>
-              <w:t xml:space="preserve">resources/templates/</w:t>
+              <w:t>controller/</w:t>
             </w:r>
           </w:p>
         </w:tc>
@@ -1163,7 +1018,311 @@
                 <w:sz w:val="19"/>
                 <w:lang w:val="es-CO"/>
               </w:rPr>
-              <w:t xml:space="preserve">Las páginas HTML (Thymeleaf) y las páginas de error 404 y 500</w:t>
+              <w:t>Un …Controller por página: inicio, clientes, mascotas, agenda, inventario, facturas, personal y álgebra; recibe la ruta y entrega los datos a la vista</w:t>
+            </w:r>
+            <w:r>
+              <w:rPr>
+                <w:sz w:val="19"/>
+                <w:lang w:val="es-CO"/>
+              </w:rPr>
+            </w:r>
+            <w:r>
+              <w:rPr>
+                <w:rStyle w:val="VerbatimChar"/>
+                <w:sz w:val="19"/>
+                <w:lang w:val="es-CO"/>
+              </w:rPr>
+            </w:r>
+            <w:r>
+              <w:rPr>
+                <w:sz w:val="19"/>
+                <w:lang w:val="es-CO"/>
+              </w:rPr>
+            </w:r>
+            <w:r>
+              <w:rPr>
+                <w:sz w:val="19"/>
+                <w:lang w:val="es-CO"/>
+              </w:rPr>
+            </w:r>
+            <w:r>
+              <w:rPr>
+                <w:rStyle w:val="VerbatimChar"/>
+                <w:sz w:val="19"/>
+                <w:lang w:val="es-CO"/>
+              </w:rPr>
+            </w:r>
+          </w:p>
+        </w:tc>
+      </w:tr>
+      <w:tr>
+        <w:trPr>
+          <w:cantSplit/>
+        </w:trPr>
+        <w:tc>
+          <w:tcPr/>
+          <w:p>
+            <w:pPr>
+              <w:pStyle w:val="Compact"/>
+            </w:pPr>
+            <w:r>
+              <w:rPr>
+                <w:rStyle w:val="VerbatimChar"/>
+                <w:sz w:val="19"/>
+                <w:lang w:val="es-CO"/>
+              </w:rPr>
+              <w:t>exception/</w:t>
+            </w:r>
+          </w:p>
+        </w:tc>
+        <w:tc>
+          <w:tcPr/>
+          <w:p>
+            <w:pPr>
+              <w:pStyle w:val="Compact"/>
+            </w:pPr>
+            <w:r>
+              <w:rPr>
+                <w:sz w:val="19"/>
+                <w:lang w:val="es-CO"/>
+              </w:rPr>
+              <w:t>RecursoNoEncontradoException: Spring la convierte en una respuesta HTTP 404</w:t>
+            </w:r>
+            <w:r>
+              <w:rPr>
+                <w:sz w:val="19"/>
+                <w:lang w:val="es-CO"/>
+              </w:rPr>
+            </w:r>
+            <w:r>
+              <w:rPr>
+                <w:rStyle w:val="VerbatimChar"/>
+                <w:sz w:val="19"/>
+                <w:lang w:val="es-CO"/>
+              </w:rPr>
+            </w:r>
+            <w:r>
+              <w:rPr>
+                <w:sz w:val="19"/>
+                <w:lang w:val="es-CO"/>
+              </w:rPr>
+            </w:r>
+            <w:r>
+              <w:rPr>
+                <w:sz w:val="19"/>
+                <w:lang w:val="es-CO"/>
+              </w:rPr>
+            </w:r>
+            <w:r>
+              <w:rPr>
+                <w:rStyle w:val="VerbatimChar"/>
+                <w:sz w:val="19"/>
+                <w:lang w:val="es-CO"/>
+              </w:rPr>
+            </w:r>
+          </w:p>
+        </w:tc>
+      </w:tr>
+      <w:tr>
+        <w:trPr>
+          <w:cantSplit/>
+        </w:trPr>
+        <w:tc>
+          <w:tcPr/>
+          <w:p>
+            <w:pPr>
+              <w:pStyle w:val="Compact"/>
+            </w:pPr>
+            <w:r>
+              <w:rPr>
+                <w:rStyle w:val="VerbatimChar"/>
+                <w:sz w:val="19"/>
+                <w:lang w:val="es-CO"/>
+              </w:rPr>
+              <w:t>util/</w:t>
+            </w:r>
+          </w:p>
+        </w:tc>
+        <w:tc>
+          <w:tcPr/>
+          <w:p>
+            <w:pPr>
+              <w:pStyle w:val="Compact"/>
+            </w:pPr>
+            <w:r>
+              <w:rPr>
+                <w:sz w:val="19"/>
+                <w:lang w:val="es-CO"/>
+              </w:rPr>
+              <w:t>TextoUtil: utilidades de texto para los filtros de los formularios</w:t>
+            </w:r>
+            <w:r>
+              <w:rPr>
+                <w:sz w:val="19"/>
+                <w:lang w:val="es-CO"/>
+              </w:rPr>
+            </w:r>
+            <w:r>
+              <w:rPr>
+                <w:rStyle w:val="VerbatimChar"/>
+                <w:sz w:val="19"/>
+                <w:lang w:val="es-CO"/>
+              </w:rPr>
+            </w:r>
+            <w:r>
+              <w:rPr>
+                <w:sz w:val="19"/>
+                <w:lang w:val="es-CO"/>
+              </w:rPr>
+            </w:r>
+            <w:r>
+              <w:rPr>
+                <w:sz w:val="19"/>
+                <w:lang w:val="es-CO"/>
+              </w:rPr>
+            </w:r>
+            <w:r>
+              <w:rPr>
+                <w:rStyle w:val="VerbatimChar"/>
+                <w:sz w:val="19"/>
+                <w:lang w:val="es-CO"/>
+              </w:rPr>
+            </w:r>
+          </w:p>
+        </w:tc>
+      </w:tr>
+      <w:tr>
+        <w:trPr>
+          <w:cantSplit/>
+        </w:trPr>
+        <w:tc>
+          <w:tcPr/>
+          <w:p>
+            <w:pPr>
+              <w:pStyle w:val="Compact"/>
+            </w:pPr>
+            <w:r>
+              <w:rPr>
+                <w:rStyle w:val="VerbatimChar"/>
+                <w:sz w:val="19"/>
+                <w:lang w:val="es-CO"/>
+              </w:rPr>
+              <w:t>algebra/LectorAlgebra.java</w:t>
+            </w:r>
+          </w:p>
+        </w:tc>
+        <w:tc>
+          <w:tcPr/>
+          <w:p>
+            <w:pPr>
+              <w:pStyle w:val="Compact"/>
+            </w:pPr>
+            <w:r>
+              <w:rPr>
+                <w:sz w:val="19"/>
+                <w:lang w:val="es-CO"/>
+              </w:rPr>
+              <w:t>Lee los 55 ejercicios del script 01_consultas_algebra_relacional.sql línea por línea</w:t>
+            </w:r>
+            <w:r>
+              <w:rPr>
+                <w:sz w:val="19"/>
+                <w:lang w:val="es-CO"/>
+              </w:rPr>
+            </w:r>
+            <w:r>
+              <w:rPr>
+                <w:rStyle w:val="VerbatimChar"/>
+                <w:sz w:val="19"/>
+                <w:lang w:val="es-CO"/>
+              </w:rPr>
+            </w:r>
+            <w:r>
+              <w:rPr>
+                <w:sz w:val="19"/>
+                <w:lang w:val="es-CO"/>
+              </w:rPr>
+            </w:r>
+            <w:r>
+              <w:rPr>
+                <w:sz w:val="19"/>
+                <w:lang w:val="es-CO"/>
+              </w:rPr>
+            </w:r>
+            <w:r>
+              <w:rPr>
+                <w:rStyle w:val="VerbatimChar"/>
+                <w:sz w:val="19"/>
+                <w:lang w:val="es-CO"/>
+              </w:rPr>
+            </w:r>
+          </w:p>
+        </w:tc>
+      </w:tr>
+      <w:tr>
+        <w:trPr>
+          <w:cantSplit/>
+        </w:trPr>
+        <w:tc>
+          <w:tcPr/>
+          <w:p>
+            <w:pPr>
+              <w:pStyle w:val="Compact"/>
+            </w:pPr>
+            <w:r>
+              <w:rPr>
+                <w:rStyle w:val="VerbatimChar"/>
+                <w:sz w:val="19"/>
+                <w:lang w:val="es-CO"/>
+              </w:rPr>
+              <w:t>resources/templates/</w:t>
+            </w:r>
+          </w:p>
+        </w:tc>
+        <w:tc>
+          <w:tcPr/>
+          <w:p>
+            <w:pPr>
+              <w:pStyle w:val="Compact"/>
+            </w:pPr>
+            <w:r>
+              <w:rPr>
+                <w:sz w:val="19"/>
+                <w:lang w:val="es-CO"/>
+              </w:rPr>
+              <w:t>Las páginas HTML (Thymeleaf) y las páginas de error 404 y 500</w:t>
+            </w:r>
+            <w:r>
+              <w:rPr>
+                <w:sz w:val="19"/>
+                <w:lang w:val="es-CO"/>
+              </w:rPr>
+            </w:r>
+            <w:r>
+              <w:rPr>
+                <w:rStyle w:val="VerbatimChar"/>
+                <w:sz w:val="19"/>
+                <w:lang w:val="es-CO"/>
+              </w:rPr>
+            </w:r>
+            <w:r>
+              <w:rPr>
+                <w:sz w:val="19"/>
+                <w:lang w:val="es-CO"/>
+              </w:rPr>
+            </w:r>
+            <w:r>
+              <w:rPr>
+                <w:sz w:val="19"/>
+                <w:lang w:val="es-CO"/>
+              </w:rPr>
+            </w:r>
+            <w:r>
+              <w:rPr>
+                <w:rStyle w:val="VerbatimChar"/>
+                <w:sz w:val="19"/>
+                <w:lang w:val="es-CO"/>
+              </w:rPr>
             </w:r>
           </w:p>
         </w:tc>
@@ -1202,26 +1361,23 @@
         <w:rPr>
           <w:lang w:val="es-CO"/>
         </w:rPr>
-        <w:t xml:space="preserve">y convierte filas en objetos. No se usa JPA, Hibernate, Spring Data ni</w:t>
-      </w:r>
-      <w:r>
-        <w:rPr>
-          <w:lang w:val="es-CO"/>
-        </w:rPr>
-        <w:t xml:space="preserve"> </w:t>
+        <w:t>y convierte filas en objetos. No se usa JPA, Hibernate, Spring Data ni JdbcTemplate. El controlador no llama a los DAO: pide los datos a un servicio, que combina uno o varios DAO y entrega un objeto DTO ya armado para la página. Si el registro no existe, el servicio lanza RecursoNoEncontradoException y Spring responde con un 404.</w:t>
+      </w:r>
+      <w:r>
+        <w:rPr>
+          <w:lang w:val="es-CO"/>
+        </w:rPr>
       </w:r>
       <w:r>
         <w:rPr>
           <w:rStyle w:val="VerbatimChar"/>
           <w:lang w:val="es-CO"/>
         </w:rPr>
-        <w:t xml:space="preserve">JdbcTemplate</w:t>
-      </w:r>
-      <w:r>
-        <w:rPr>
-          <w:lang w:val="es-CO"/>
-        </w:rPr>
-        <w:t xml:space="preserve">.</w:t>
+      </w:r>
+      <w:r>
+        <w:rPr>
+          <w:lang w:val="es-CO"/>
+        </w:rPr>
       </w:r>
     </w:p>
     <w:p>
@@ -3231,19 +3387,19 @@
           <w:rStyle w:val="VerbatimChar"/>
           <w:lang w:val="es-CO"/>
         </w:rPr>
-        <w:t xml:space="preserve">ClienteControlador.java</w:t>
-      </w:r>
-      <w:r>
-        <w:rPr>
-          <w:lang w:val="es-CO"/>
-        </w:rPr>
-        <w:t xml:space="preserve"> </w:t>
-      </w:r>
-      <w:r>
-        <w:rPr>
-          <w:lang w:val="es-CO"/>
-        </w:rPr>
-        <w:t xml:space="preserve">utiliza el DAO:</w:t>
+        <w:t>ClienteController.java</w:t>
+      </w:r>
+      <w:r>
+        <w:rPr>
+          <w:lang w:val="es-CO"/>
+        </w:rPr>
+        <w:t xml:space="preserve"> </w:t>
+      </w:r>
+      <w:r>
+        <w:rPr>
+          <w:lang w:val="es-CO"/>
+        </w:rPr>
+        <w:t>recibe la ruta y le pide los datos a ClienteService:</w:t>
       </w:r>
     </w:p>
     <w:p>
@@ -3335,7 +3491,13 @@
         <w:rPr>
           <w:rStyle w:val="NormalTok"/>
         </w:rPr>
-        <w:t xml:space="preserve"> id</w:t>
+        <w:t xml:space="preserve"> </w:t>
+      </w:r>
+      <w:r>
+        <w:rPr>
+          <w:rStyle w:val="NormalTok"/>
+        </w:rPr>
+        <w:t xml:space="preserve">id</w:t>
       </w:r>
       <w:r>
         <w:rPr>
@@ -3347,7 +3509,25 @@
         <w:rPr>
           <w:rStyle w:val="NormalTok"/>
         </w:rPr>
-        <w:t xml:space="preserve"> Model model</w:t>
+        <w:t xml:space="preserve"> </w:t>
+      </w:r>
+      <w:r>
+        <w:rPr>
+          <w:rStyle w:val="NormalTok"/>
+        </w:rPr>
+        <w:t xml:space="preserve">Model</w:t>
+      </w:r>
+      <w:r>
+        <w:rPr>
+          <w:rStyle w:val="NormalTok"/>
+        </w:rPr>
+        <w:t xml:space="preserve"> </w:t>
+      </w:r>
+      <w:r>
+        <w:rPr>
+          <w:rStyle w:val="NormalTok"/>
+        </w:rPr>
+        <w:t xml:space="preserve">model</w:t>
       </w:r>
       <w:r>
         <w:rPr>
@@ -3374,7 +3554,31 @@
         <w:rPr>
           <w:rStyle w:val="NormalTok"/>
         </w:rPr>
-        <w:t xml:space="preserve">    Cliente cliente </w:t>
+        <w:t xml:space="preserve">    </w:t>
+      </w:r>
+      <w:r>
+        <w:rPr>
+          <w:rStyle w:val="NormalTok"/>
+        </w:rPr>
+        <w:t xml:space="preserve">ClienteDetalleDTO</w:t>
+      </w:r>
+      <w:r>
+        <w:rPr>
+          <w:rStyle w:val="NormalTok"/>
+        </w:rPr>
+        <w:t xml:space="preserve"> </w:t>
+      </w:r>
+      <w:r>
+        <w:rPr>
+          <w:rStyle w:val="NormalTok"/>
+        </w:rPr>
+        <w:t xml:space="preserve">detalle</w:t>
+      </w:r>
+      <w:r>
+        <w:rPr>
+          <w:rStyle w:val="NormalTok"/>
+        </w:rPr>
+        <w:t xml:space="preserve"> </w:t>
       </w:r>
       <w:r>
         <w:rPr>
@@ -3386,7 +3590,13 @@
         <w:rPr>
           <w:rStyle w:val="NormalTok"/>
         </w:rPr>
-        <w:t xml:space="preserve"> clienteDAO</w:t>
+        <w:t xml:space="preserve"> </w:t>
+      </w:r>
+      <w:r>
+        <w:rPr>
+          <w:rStyle w:val="NormalTok"/>
+        </w:rPr>
+        <w:t xml:space="preserve">clienteService</w:t>
       </w:r>
       <w:r>
         <w:rPr>
@@ -3398,6 +3608,608 @@
         <w:rPr>
           <w:rStyle w:val="FunctionTok"/>
         </w:rPr>
+        <w:t xml:space="preserve">detalle</w:t>
+      </w:r>
+      <w:r>
+        <w:rPr>
+          <w:rStyle w:val="OperatorTok"/>
+        </w:rPr>
+        <w:t xml:space="preserve">(</w:t>
+      </w:r>
+      <w:r>
+        <w:rPr>
+          <w:rStyle w:val="NormalTok"/>
+        </w:rPr>
+        <w:t xml:space="preserve">id</w:t>
+      </w:r>
+      <w:r>
+        <w:rPr>
+          <w:rStyle w:val="OperatorTok"/>
+        </w:rPr>
+        <w:t xml:space="preserve">)</w:t>
+      </w:r>
+      <w:r>
+        <w:rPr>
+          <w:rStyle w:val="OperatorTok"/>
+        </w:rPr>
+        <w:t xml:space="preserve">;</w:t>
+      </w:r>
+      <w:r>
+        <w:br/>
+      </w:r>
+      <w:r>
+        <w:rPr>
+          <w:rStyle w:val="NormalTok"/>
+        </w:rPr>
+        <w:t xml:space="preserve">    </w:t>
+      </w:r>
+      <w:r>
+        <w:rPr>
+          <w:rStyle w:val="NormalTok"/>
+        </w:rPr>
+        <w:t xml:space="preserve">model</w:t>
+      </w:r>
+      <w:r>
+        <w:rPr>
+          <w:rStyle w:val="OperatorTok"/>
+        </w:rPr>
+        <w:t xml:space="preserve">.</w:t>
+      </w:r>
+      <w:r>
+        <w:rPr>
+          <w:rStyle w:val="FunctionTok"/>
+        </w:rPr>
+        <w:t xml:space="preserve">addAttribute</w:t>
+      </w:r>
+      <w:r>
+        <w:rPr>
+          <w:rStyle w:val="OperatorTok"/>
+        </w:rPr>
+        <w:t xml:space="preserve">(</w:t>
+      </w:r>
+      <w:r>
+        <w:rPr>
+          <w:rStyle w:val="StringTok"/>
+        </w:rPr>
+        <w:t xml:space="preserve">"cliente"</w:t>
+      </w:r>
+      <w:r>
+        <w:rPr>
+          <w:rStyle w:val="OperatorTok"/>
+        </w:rPr>
+        <w:t xml:space="preserve">,</w:t>
+      </w:r>
+      <w:r>
+        <w:rPr>
+          <w:rStyle w:val="NormalTok"/>
+        </w:rPr>
+        <w:t xml:space="preserve"> </w:t>
+      </w:r>
+      <w:r>
+        <w:rPr>
+          <w:rStyle w:val="NormalTok"/>
+        </w:rPr>
+        <w:t xml:space="preserve">detalle</w:t>
+      </w:r>
+      <w:r>
+        <w:rPr>
+          <w:rStyle w:val="OperatorTok"/>
+        </w:rPr>
+        <w:t xml:space="preserve">.</w:t>
+      </w:r>
+      <w:r>
+        <w:rPr>
+          <w:rStyle w:val="FunctionTok"/>
+        </w:rPr>
+        <w:t xml:space="preserve">getCliente</w:t>
+      </w:r>
+      <w:r>
+        <w:rPr>
+          <w:rStyle w:val="OperatorTok"/>
+        </w:rPr>
+        <w:t xml:space="preserve">(</w:t>
+      </w:r>
+      <w:r>
+        <w:rPr>
+          <w:rStyle w:val="OperatorTok"/>
+        </w:rPr>
+        <w:t xml:space="preserve">)</w:t>
+      </w:r>
+      <w:r>
+        <w:rPr>
+          <w:rStyle w:val="OperatorTok"/>
+        </w:rPr>
+        <w:t xml:space="preserve">)</w:t>
+      </w:r>
+      <w:r>
+        <w:rPr>
+          <w:rStyle w:val="OperatorTok"/>
+        </w:rPr>
+        <w:t xml:space="preserve">;</w:t>
+      </w:r>
+      <w:r>
+        <w:br/>
+      </w:r>
+      <w:r>
+        <w:rPr>
+          <w:rStyle w:val="NormalTok"/>
+        </w:rPr>
+        <w:t xml:space="preserve">    </w:t>
+      </w:r>
+      <w:r>
+        <w:rPr>
+          <w:rStyle w:val="NormalTok"/>
+        </w:rPr>
+        <w:t xml:space="preserve">model</w:t>
+      </w:r>
+      <w:r>
+        <w:rPr>
+          <w:rStyle w:val="OperatorTok"/>
+        </w:rPr>
+        <w:t xml:space="preserve">.</w:t>
+      </w:r>
+      <w:r>
+        <w:rPr>
+          <w:rStyle w:val="FunctionTok"/>
+        </w:rPr>
+        <w:t xml:space="preserve">addAttribute</w:t>
+      </w:r>
+      <w:r>
+        <w:rPr>
+          <w:rStyle w:val="OperatorTok"/>
+        </w:rPr>
+        <w:t xml:space="preserve">(</w:t>
+      </w:r>
+      <w:r>
+        <w:rPr>
+          <w:rStyle w:val="StringTok"/>
+        </w:rPr>
+        <w:t xml:space="preserve">"telefonos"</w:t>
+      </w:r>
+      <w:r>
+        <w:rPr>
+          <w:rStyle w:val="OperatorTok"/>
+        </w:rPr>
+        <w:t xml:space="preserve">,</w:t>
+      </w:r>
+      <w:r>
+        <w:rPr>
+          <w:rStyle w:val="NormalTok"/>
+        </w:rPr>
+        <w:t xml:space="preserve"> </w:t>
+      </w:r>
+      <w:r>
+        <w:rPr>
+          <w:rStyle w:val="NormalTok"/>
+        </w:rPr>
+        <w:t xml:space="preserve">detalle</w:t>
+      </w:r>
+      <w:r>
+        <w:rPr>
+          <w:rStyle w:val="OperatorTok"/>
+        </w:rPr>
+        <w:t xml:space="preserve">.</w:t>
+      </w:r>
+      <w:r>
+        <w:rPr>
+          <w:rStyle w:val="FunctionTok"/>
+        </w:rPr>
+        <w:t xml:space="preserve">getTelefonos</w:t>
+      </w:r>
+      <w:r>
+        <w:rPr>
+          <w:rStyle w:val="OperatorTok"/>
+        </w:rPr>
+        <w:t xml:space="preserve">(</w:t>
+      </w:r>
+      <w:r>
+        <w:rPr>
+          <w:rStyle w:val="OperatorTok"/>
+        </w:rPr>
+        <w:t xml:space="preserve">)</w:t>
+      </w:r>
+      <w:r>
+        <w:rPr>
+          <w:rStyle w:val="OperatorTok"/>
+        </w:rPr>
+        <w:t xml:space="preserve">)</w:t>
+      </w:r>
+      <w:r>
+        <w:rPr>
+          <w:rStyle w:val="OperatorTok"/>
+        </w:rPr>
+        <w:t xml:space="preserve">;</w:t>
+      </w:r>
+      <w:r>
+        <w:br/>
+      </w:r>
+      <w:r>
+        <w:rPr>
+          <w:rStyle w:val="NormalTok"/>
+        </w:rPr>
+        <w:t xml:space="preserve">    </w:t>
+      </w:r>
+      <w:r>
+        <w:rPr>
+          <w:rStyle w:val="NormalTok"/>
+        </w:rPr>
+        <w:t xml:space="preserve">model</w:t>
+      </w:r>
+      <w:r>
+        <w:rPr>
+          <w:rStyle w:val="OperatorTok"/>
+        </w:rPr>
+        <w:t xml:space="preserve">.</w:t>
+      </w:r>
+      <w:r>
+        <w:rPr>
+          <w:rStyle w:val="FunctionTok"/>
+        </w:rPr>
+        <w:t xml:space="preserve">addAttribute</w:t>
+      </w:r>
+      <w:r>
+        <w:rPr>
+          <w:rStyle w:val="OperatorTok"/>
+        </w:rPr>
+        <w:t xml:space="preserve">(</w:t>
+      </w:r>
+      <w:r>
+        <w:rPr>
+          <w:rStyle w:val="StringTok"/>
+        </w:rPr>
+        <w:t xml:space="preserve">"mascotas"</w:t>
+      </w:r>
+      <w:r>
+        <w:rPr>
+          <w:rStyle w:val="OperatorTok"/>
+        </w:rPr>
+        <w:t xml:space="preserve">,</w:t>
+      </w:r>
+      <w:r>
+        <w:rPr>
+          <w:rStyle w:val="NormalTok"/>
+        </w:rPr>
+        <w:t xml:space="preserve"> </w:t>
+      </w:r>
+      <w:r>
+        <w:rPr>
+          <w:rStyle w:val="NormalTok"/>
+        </w:rPr>
+        <w:t xml:space="preserve">detalle</w:t>
+      </w:r>
+      <w:r>
+        <w:rPr>
+          <w:rStyle w:val="OperatorTok"/>
+        </w:rPr>
+        <w:t xml:space="preserve">.</w:t>
+      </w:r>
+      <w:r>
+        <w:rPr>
+          <w:rStyle w:val="FunctionTok"/>
+        </w:rPr>
+        <w:t xml:space="preserve">getMascotas</w:t>
+      </w:r>
+      <w:r>
+        <w:rPr>
+          <w:rStyle w:val="OperatorTok"/>
+        </w:rPr>
+        <w:t xml:space="preserve">(</w:t>
+      </w:r>
+      <w:r>
+        <w:rPr>
+          <w:rStyle w:val="OperatorTok"/>
+        </w:rPr>
+        <w:t xml:space="preserve">)</w:t>
+      </w:r>
+      <w:r>
+        <w:rPr>
+          <w:rStyle w:val="OperatorTok"/>
+        </w:rPr>
+        <w:t xml:space="preserve">)</w:t>
+      </w:r>
+      <w:r>
+        <w:rPr>
+          <w:rStyle w:val="OperatorTok"/>
+        </w:rPr>
+        <w:t xml:space="preserve">;</w:t>
+      </w:r>
+      <w:r>
+        <w:br/>
+      </w:r>
+      <w:r>
+        <w:rPr>
+          <w:rStyle w:val="NormalTok"/>
+        </w:rPr>
+        <w:t xml:space="preserve">    </w:t>
+      </w:r>
+      <w:r>
+        <w:rPr>
+          <w:rStyle w:val="NormalTok"/>
+        </w:rPr>
+        <w:t xml:space="preserve">model</w:t>
+      </w:r>
+      <w:r>
+        <w:rPr>
+          <w:rStyle w:val="OperatorTok"/>
+        </w:rPr>
+        <w:t xml:space="preserve">.</w:t>
+      </w:r>
+      <w:r>
+        <w:rPr>
+          <w:rStyle w:val="FunctionTok"/>
+        </w:rPr>
+        <w:t xml:space="preserve">addAttribute</w:t>
+      </w:r>
+      <w:r>
+        <w:rPr>
+          <w:rStyle w:val="OperatorTok"/>
+        </w:rPr>
+        <w:t xml:space="preserve">(</w:t>
+      </w:r>
+      <w:r>
+        <w:rPr>
+          <w:rStyle w:val="StringTok"/>
+        </w:rPr>
+        <w:t xml:space="preserve">"facturas"</w:t>
+      </w:r>
+      <w:r>
+        <w:rPr>
+          <w:rStyle w:val="OperatorTok"/>
+        </w:rPr>
+        <w:t xml:space="preserve">,</w:t>
+      </w:r>
+      <w:r>
+        <w:rPr>
+          <w:rStyle w:val="NormalTok"/>
+        </w:rPr>
+        <w:t xml:space="preserve"> </w:t>
+      </w:r>
+      <w:r>
+        <w:rPr>
+          <w:rStyle w:val="NormalTok"/>
+        </w:rPr>
+        <w:t xml:space="preserve">detalle</w:t>
+      </w:r>
+      <w:r>
+        <w:rPr>
+          <w:rStyle w:val="OperatorTok"/>
+        </w:rPr>
+        <w:t xml:space="preserve">.</w:t>
+      </w:r>
+      <w:r>
+        <w:rPr>
+          <w:rStyle w:val="FunctionTok"/>
+        </w:rPr>
+        <w:t xml:space="preserve">getFacturas</w:t>
+      </w:r>
+      <w:r>
+        <w:rPr>
+          <w:rStyle w:val="OperatorTok"/>
+        </w:rPr>
+        <w:t xml:space="preserve">(</w:t>
+      </w:r>
+      <w:r>
+        <w:rPr>
+          <w:rStyle w:val="OperatorTok"/>
+        </w:rPr>
+        <w:t xml:space="preserve">)</w:t>
+      </w:r>
+      <w:r>
+        <w:rPr>
+          <w:rStyle w:val="OperatorTok"/>
+        </w:rPr>
+        <w:t xml:space="preserve">)</w:t>
+      </w:r>
+      <w:r>
+        <w:rPr>
+          <w:rStyle w:val="OperatorTok"/>
+        </w:rPr>
+        <w:t xml:space="preserve">;</w:t>
+      </w:r>
+      <w:r>
+        <w:br/>
+      </w:r>
+      <w:r>
+        <w:rPr>
+          <w:rStyle w:val="NormalTok"/>
+        </w:rPr>
+        <w:t xml:space="preserve">    </w:t>
+      </w:r>
+      <w:r>
+        <w:rPr>
+          <w:rStyle w:val="ControlFlowTok"/>
+        </w:rPr>
+        <w:t xml:space="preserve">return</w:t>
+      </w:r>
+      <w:r>
+        <w:rPr>
+          <w:rStyle w:val="NormalTok"/>
+        </w:rPr>
+        <w:t xml:space="preserve"> </w:t>
+      </w:r>
+      <w:r>
+        <w:rPr>
+          <w:rStyle w:val="StringTok"/>
+        </w:rPr>
+        <w:t xml:space="preserve">"cliente"</w:t>
+      </w:r>
+      <w:r>
+        <w:rPr>
+          <w:rStyle w:val="OperatorTok"/>
+        </w:rPr>
+        <w:t xml:space="preserve">;</w:t>
+      </w:r>
+      <w:r>
+        <w:br/>
+      </w:r>
+      <w:r>
+        <w:rPr>
+          <w:rStyle w:val="OperatorTok"/>
+        </w:rPr>
+        <w:t xml:space="preserve">}</w:t>
+      </w:r>
+    </w:p>
+    <w:p>
+      <w:pPr>
+        <w:pStyle w:val="FirstParagraph"/>
+      </w:pPr>
+      <w:r>
+        <w:rPr>
+          <w:rStyle w:val="VerbatimChar"/>
+          <w:lang w:val="es-CO"/>
+        </w:rPr>
+        <w:t>ClienteService.java</w:t>
+      </w:r>
+      <w:r>
+        <w:rPr>
+          <w:lang w:val="es-CO"/>
+        </w:rPr>
+        <w:t xml:space="preserve"> </w:t>
+      </w:r>
+      <w:r>
+        <w:rPr>
+          <w:lang w:val="es-CO"/>
+        </w:rPr>
+        <w:t>reúne los datos de varios DAO y rechaza al cliente que no existe:</w:t>
+      </w:r>
+    </w:p>
+    <w:p>
+      <w:pPr>
+        <w:pStyle w:val="SourceCode"/>
+      </w:pPr>
+      <w:r>
+        <w:rPr>
+          <w:rStyle w:val="KeywordTok"/>
+        </w:rPr>
+        <w:t xml:space="preserve">public</w:t>
+      </w:r>
+      <w:r>
+        <w:rPr>
+          <w:rStyle w:val="NormalTok"/>
+        </w:rPr>
+        <w:t xml:space="preserve"> </w:t>
+      </w:r>
+      <w:r>
+        <w:rPr>
+          <w:rStyle w:val="NormalTok"/>
+        </w:rPr>
+        <w:t xml:space="preserve">ClienteDetalleDTO</w:t>
+      </w:r>
+      <w:r>
+        <w:rPr>
+          <w:rStyle w:val="NormalTok"/>
+        </w:rPr>
+        <w:t xml:space="preserve"> </w:t>
+      </w:r>
+      <w:r>
+        <w:rPr>
+          <w:rStyle w:val="FunctionTok"/>
+        </w:rPr>
+        <w:t xml:space="preserve">detalle</w:t>
+      </w:r>
+      <w:r>
+        <w:rPr>
+          <w:rStyle w:val="OperatorTok"/>
+        </w:rPr>
+        <w:t xml:space="preserve">(</w:t>
+      </w:r>
+      <w:r>
+        <w:rPr>
+          <w:rStyle w:val="DataTypeTok"/>
+        </w:rPr>
+        <w:t xml:space="preserve">int</w:t>
+      </w:r>
+      <w:r>
+        <w:rPr>
+          <w:rStyle w:val="NormalTok"/>
+        </w:rPr>
+        <w:t xml:space="preserve"> </w:t>
+      </w:r>
+      <w:r>
+        <w:rPr>
+          <w:rStyle w:val="NormalTok"/>
+        </w:rPr>
+        <w:t xml:space="preserve">id</w:t>
+      </w:r>
+      <w:r>
+        <w:rPr>
+          <w:rStyle w:val="OperatorTok"/>
+        </w:rPr>
+        <w:t xml:space="preserve">)</w:t>
+      </w:r>
+      <w:r>
+        <w:rPr>
+          <w:rStyle w:val="NormalTok"/>
+        </w:rPr>
+        <w:t xml:space="preserve"> </w:t>
+      </w:r>
+      <w:r>
+        <w:rPr>
+          <w:rStyle w:val="OperatorTok"/>
+        </w:rPr>
+        <w:t xml:space="preserve">{</w:t>
+      </w:r>
+      <w:r>
+        <w:br/>
+      </w:r>
+      <w:r>
+        <w:rPr>
+          <w:rStyle w:val="NormalTok"/>
+        </w:rPr>
+        <w:t xml:space="preserve">    </w:t>
+      </w:r>
+      <w:r>
+        <w:rPr>
+          <w:rStyle w:val="NormalTok"/>
+        </w:rPr>
+        <w:t xml:space="preserve">Cliente</w:t>
+      </w:r>
+      <w:r>
+        <w:rPr>
+          <w:rStyle w:val="NormalTok"/>
+        </w:rPr>
+        <w:t xml:space="preserve"> </w:t>
+      </w:r>
+      <w:r>
+        <w:rPr>
+          <w:rStyle w:val="NormalTok"/>
+        </w:rPr>
+        <w:t xml:space="preserve">cliente</w:t>
+      </w:r>
+      <w:r>
+        <w:rPr>
+          <w:rStyle w:val="NormalTok"/>
+        </w:rPr>
+        <w:t xml:space="preserve"> </w:t>
+      </w:r>
+      <w:r>
+        <w:rPr>
+          <w:rStyle w:val="OperatorTok"/>
+        </w:rPr>
+        <w:t xml:space="preserve">=</w:t>
+      </w:r>
+      <w:r>
+        <w:rPr>
+          <w:rStyle w:val="NormalTok"/>
+        </w:rPr>
+        <w:t xml:space="preserve"> </w:t>
+      </w:r>
+      <w:r>
+        <w:rPr>
+          <w:rStyle w:val="NormalTok"/>
+        </w:rPr>
+        <w:t xml:space="preserve">clienteDAO</w:t>
+      </w:r>
+      <w:r>
+        <w:rPr>
+          <w:rStyle w:val="OperatorTok"/>
+        </w:rPr>
+        <w:t xml:space="preserve">.</w:t>
+      </w:r>
+      <w:r>
+        <w:rPr>
+          <w:rStyle w:val="FunctionTok"/>
+        </w:rPr>
         <w:t xml:space="preserve">buscar</w:t>
       </w:r>
       <w:r>
@@ -3416,7 +4228,13 @@
         <w:rPr>
           <w:rStyle w:val="OperatorTok"/>
         </w:rPr>
-        <w:t xml:space="preserve">);</w:t>
+        <w:t xml:space="preserve">)</w:t>
+      </w:r>
+      <w:r>
+        <w:rPr>
+          <w:rStyle w:val="OperatorTok"/>
+        </w:rPr>
+        <w:t xml:space="preserve">;</w:t>
       </w:r>
       <w:r>
         <w:br/>
@@ -3449,13 +4267,70 @@
         <w:rPr>
           <w:rStyle w:val="NormalTok"/>
         </w:rPr>
-        <w:t xml:space="preserve">cliente </w:t>
-      </w:r>
-      <w:r>
-        <w:rPr>
-          <w:rStyle w:val="OperatorTok"/>
-        </w:rPr>
-        <w:t xml:space="preserve">==</w:t>
+        <w:t xml:space="preserve">cliente</w:t>
+      </w:r>
+      <w:r>
+        <w:rPr>
+          <w:rStyle w:val="NormalTok"/>
+        </w:rPr>
+        <w:t xml:space="preserve"> </w:t>
+      </w:r>
+      <w:r>
+        <w:rPr>
+          <w:rStyle w:val="OperatorTok"/>
+        </w:rPr>
+        <w:t xml:space="preserve">=</w:t>
+      </w:r>
+      <w:r>
+        <w:rPr>
+          <w:rStyle w:val="OperatorTok"/>
+        </w:rPr>
+        <w:t xml:space="preserve">=</w:t>
+      </w:r>
+      <w:r>
+        <w:rPr>
+          <w:rStyle w:val="NormalTok"/>
+        </w:rPr>
+        <w:t xml:space="preserve"> </w:t>
+      </w:r>
+      <w:r>
+        <w:rPr>
+          <w:rStyle w:val="NormalTok"/>
+        </w:rPr>
+        <w:t xml:space="preserve">null</w:t>
+      </w:r>
+      <w:r>
+        <w:rPr>
+          <w:rStyle w:val="OperatorTok"/>
+        </w:rPr>
+        <w:t xml:space="preserve">)</w:t>
+      </w:r>
+      <w:r>
+        <w:rPr>
+          <w:rStyle w:val="NormalTok"/>
+        </w:rPr>
+        <w:t xml:space="preserve"> </w:t>
+      </w:r>
+      <w:r>
+        <w:rPr>
+          <w:rStyle w:val="OperatorTok"/>
+        </w:rPr>
+        <w:t xml:space="preserve">{</w:t>
+      </w:r>
+      <w:r>
+        <w:br/>
+      </w:r>
+      <w:r>
+        <w:rPr>
+          <w:rStyle w:val="NormalTok"/>
+        </w:rPr>
+        <w:t xml:space="preserve">        </w:t>
+      </w:r>
+      <w:r>
+        <w:rPr>
+          <w:rStyle w:val="ControlFlowTok"/>
+        </w:rPr>
+        <w:t xml:space="preserve">throw</w:t>
       </w:r>
       <w:r>
         <w:rPr>
@@ -3467,7 +4342,55 @@
         <w:rPr>
           <w:rStyle w:val="KeywordTok"/>
         </w:rPr>
-        <w:t xml:space="preserve">null</w:t>
+        <w:t xml:space="preserve">new</w:t>
+      </w:r>
+      <w:r>
+        <w:rPr>
+          <w:rStyle w:val="NormalTok"/>
+        </w:rPr>
+        <w:t xml:space="preserve"> </w:t>
+      </w:r>
+      <w:r>
+        <w:rPr>
+          <w:rStyle w:val="FunctionTok"/>
+        </w:rPr>
+        <w:t xml:space="preserve">RecursoNoEncontradoException</w:t>
+      </w:r>
+      <w:r>
+        <w:rPr>
+          <w:rStyle w:val="OperatorTok"/>
+        </w:rPr>
+        <w:t xml:space="preserve">(</w:t>
+      </w:r>
+      <w:r>
+        <w:rPr>
+          <w:rStyle w:val="StringTok"/>
+        </w:rPr>
+        <w:t xml:space="preserve">"No existe el cliente "</w:t>
+      </w:r>
+      <w:r>
+        <w:rPr>
+          <w:rStyle w:val="NormalTok"/>
+        </w:rPr>
+        <w:t xml:space="preserve"> </w:t>
+      </w:r>
+      <w:r>
+        <w:rPr>
+          <w:rStyle w:val="OperatorTok"/>
+        </w:rPr>
+        <w:t xml:space="preserve">+</w:t>
+      </w:r>
+      <w:r>
+        <w:rPr>
+          <w:rStyle w:val="NormalTok"/>
+        </w:rPr>
+        <w:t xml:space="preserve"> </w:t>
+      </w:r>
+      <w:r>
+        <w:rPr>
+          <w:rStyle w:val="NormalTok"/>
+        </w:rPr>
+        <w:t xml:space="preserve">id</w:t>
       </w:r>
       <w:r>
         <w:rPr>
@@ -3477,15 +4400,9 @@
       </w:r>
       <w:r>
         <w:rPr>
-          <w:rStyle w:val="NormalTok"/>
-        </w:rPr>
-        <w:t xml:space="preserve"> </w:t>
-      </w:r>
-      <w:r>
-        <w:rPr>
-          <w:rStyle w:val="OperatorTok"/>
-        </w:rPr>
-        <w:t xml:space="preserve">{</w:t>
+          <w:rStyle w:val="OperatorTok"/>
+        </w:rPr>
+        <w:t xml:space="preserve">;</w:t>
       </w:r>
       <w:r>
         <w:br/>
@@ -3494,13 +4411,343 @@
         <w:rPr>
           <w:rStyle w:val="NormalTok"/>
         </w:rPr>
-        <w:t xml:space="preserve">        </w:t>
+        <w:t xml:space="preserve">    </w:t>
+      </w:r>
+      <w:r>
+        <w:rPr>
+          <w:rStyle w:val="OperatorTok"/>
+        </w:rPr>
+        <w:t xml:space="preserve">}</w:t>
+      </w:r>
+      <w:r>
+        <w:br/>
+      </w:r>
+      <w:r>
+        <w:rPr>
+          <w:rStyle w:val="NormalTok"/>
+        </w:rPr>
+        <w:t xml:space="preserve">    </w:t>
+      </w:r>
+      <w:r>
+        <w:rPr>
+          <w:rStyle w:val="NormalTok"/>
+        </w:rPr>
+        <w:t xml:space="preserve">ArrayList</w:t>
+      </w:r>
+      <w:r>
+        <w:rPr>
+          <w:rStyle w:val="OperatorTok"/>
+        </w:rPr>
+        <w:t xml:space="preserve">&lt;</w:t>
+      </w:r>
+      <w:r>
+        <w:rPr>
+          <w:rStyle w:val="NormalTok"/>
+        </w:rPr>
+        <w:t xml:space="preserve">Telefono</w:t>
+      </w:r>
+      <w:r>
+        <w:rPr>
+          <w:rStyle w:val="OperatorTok"/>
+        </w:rPr>
+        <w:t xml:space="preserve">&gt;</w:t>
+      </w:r>
+      <w:r>
+        <w:rPr>
+          <w:rStyle w:val="NormalTok"/>
+        </w:rPr>
+        <w:t xml:space="preserve"> </w:t>
+      </w:r>
+      <w:r>
+        <w:rPr>
+          <w:rStyle w:val="NormalTok"/>
+        </w:rPr>
+        <w:t xml:space="preserve">telefonos</w:t>
+      </w:r>
+      <w:r>
+        <w:rPr>
+          <w:rStyle w:val="NormalTok"/>
+        </w:rPr>
+        <w:t xml:space="preserve"> </w:t>
+      </w:r>
+      <w:r>
+        <w:rPr>
+          <w:rStyle w:val="OperatorTok"/>
+        </w:rPr>
+        <w:t xml:space="preserve">=</w:t>
+      </w:r>
+      <w:r>
+        <w:rPr>
+          <w:rStyle w:val="NormalTok"/>
+        </w:rPr>
+        <w:t xml:space="preserve"> </w:t>
+      </w:r>
+      <w:r>
+        <w:rPr>
+          <w:rStyle w:val="NormalTok"/>
+        </w:rPr>
+        <w:t xml:space="preserve">clienteDAO</w:t>
+      </w:r>
+      <w:r>
+        <w:rPr>
+          <w:rStyle w:val="OperatorTok"/>
+        </w:rPr>
+        <w:t xml:space="preserve">.</w:t>
+      </w:r>
+      <w:r>
+        <w:rPr>
+          <w:rStyle w:val="FunctionTok"/>
+        </w:rPr>
+        <w:t xml:space="preserve">telefonos</w:t>
+      </w:r>
+      <w:r>
+        <w:rPr>
+          <w:rStyle w:val="OperatorTok"/>
+        </w:rPr>
+        <w:t xml:space="preserve">(</w:t>
+      </w:r>
+      <w:r>
+        <w:rPr>
+          <w:rStyle w:val="NormalTok"/>
+        </w:rPr>
+        <w:t xml:space="preserve">id</w:t>
+      </w:r>
+      <w:r>
+        <w:rPr>
+          <w:rStyle w:val="OperatorTok"/>
+        </w:rPr>
+        <w:t xml:space="preserve">)</w:t>
+      </w:r>
+      <w:r>
+        <w:rPr>
+          <w:rStyle w:val="OperatorTok"/>
+        </w:rPr>
+        <w:t xml:space="preserve">;</w:t>
+      </w:r>
+      <w:r>
+        <w:br/>
+      </w:r>
+      <w:r>
+        <w:rPr>
+          <w:rStyle w:val="NormalTok"/>
+        </w:rPr>
+        <w:t xml:space="preserve">    </w:t>
+      </w:r>
+      <w:r>
+        <w:rPr>
+          <w:rStyle w:val="NormalTok"/>
+        </w:rPr>
+        <w:t xml:space="preserve">ArrayList</w:t>
+      </w:r>
+      <w:r>
+        <w:rPr>
+          <w:rStyle w:val="OperatorTok"/>
+        </w:rPr>
+        <w:t xml:space="preserve">&lt;</w:t>
+      </w:r>
+      <w:r>
+        <w:rPr>
+          <w:rStyle w:val="NormalTok"/>
+        </w:rPr>
+        <w:t xml:space="preserve">Mascota</w:t>
+      </w:r>
+      <w:r>
+        <w:rPr>
+          <w:rStyle w:val="OperatorTok"/>
+        </w:rPr>
+        <w:t xml:space="preserve">&gt;</w:t>
+      </w:r>
+      <w:r>
+        <w:rPr>
+          <w:rStyle w:val="NormalTok"/>
+        </w:rPr>
+        <w:t xml:space="preserve"> </w:t>
+      </w:r>
+      <w:r>
+        <w:rPr>
+          <w:rStyle w:val="NormalTok"/>
+        </w:rPr>
+        <w:t xml:space="preserve">mascotas</w:t>
+      </w:r>
+      <w:r>
+        <w:rPr>
+          <w:rStyle w:val="NormalTok"/>
+        </w:rPr>
+        <w:t xml:space="preserve"> </w:t>
+      </w:r>
+      <w:r>
+        <w:rPr>
+          <w:rStyle w:val="OperatorTok"/>
+        </w:rPr>
+        <w:t xml:space="preserve">=</w:t>
+      </w:r>
+      <w:r>
+        <w:rPr>
+          <w:rStyle w:val="NormalTok"/>
+        </w:rPr>
+        <w:t xml:space="preserve"> </w:t>
+      </w:r>
+      <w:r>
+        <w:rPr>
+          <w:rStyle w:val="NormalTok"/>
+        </w:rPr>
+        <w:t xml:space="preserve">mascotaDAO</w:t>
+      </w:r>
+      <w:r>
+        <w:rPr>
+          <w:rStyle w:val="OperatorTok"/>
+        </w:rPr>
+        <w:t xml:space="preserve">.</w:t>
+      </w:r>
+      <w:r>
+        <w:rPr>
+          <w:rStyle w:val="FunctionTok"/>
+        </w:rPr>
+        <w:t xml:space="preserve">listarPorCliente</w:t>
+      </w:r>
+      <w:r>
+        <w:rPr>
+          <w:rStyle w:val="OperatorTok"/>
+        </w:rPr>
+        <w:t xml:space="preserve">(</w:t>
+      </w:r>
+      <w:r>
+        <w:rPr>
+          <w:rStyle w:val="NormalTok"/>
+        </w:rPr>
+        <w:t xml:space="preserve">id</w:t>
+      </w:r>
+      <w:r>
+        <w:rPr>
+          <w:rStyle w:val="OperatorTok"/>
+        </w:rPr>
+        <w:t xml:space="preserve">)</w:t>
+      </w:r>
+      <w:r>
+        <w:rPr>
+          <w:rStyle w:val="OperatorTok"/>
+        </w:rPr>
+        <w:t xml:space="preserve">;</w:t>
+      </w:r>
+      <w:r>
+        <w:br/>
+      </w:r>
+      <w:r>
+        <w:rPr>
+          <w:rStyle w:val="NormalTok"/>
+        </w:rPr>
+        <w:t xml:space="preserve">    </w:t>
+      </w:r>
+      <w:r>
+        <w:rPr>
+          <w:rStyle w:val="NormalTok"/>
+        </w:rPr>
+        <w:t xml:space="preserve">ArrayList</w:t>
+      </w:r>
+      <w:r>
+        <w:rPr>
+          <w:rStyle w:val="OperatorTok"/>
+        </w:rPr>
+        <w:t xml:space="preserve">&lt;</w:t>
+      </w:r>
+      <w:r>
+        <w:rPr>
+          <w:rStyle w:val="NormalTok"/>
+        </w:rPr>
+        <w:t xml:space="preserve">Factura</w:t>
+      </w:r>
+      <w:r>
+        <w:rPr>
+          <w:rStyle w:val="OperatorTok"/>
+        </w:rPr>
+        <w:t xml:space="preserve">&gt;</w:t>
+      </w:r>
+      <w:r>
+        <w:rPr>
+          <w:rStyle w:val="NormalTok"/>
+        </w:rPr>
+        <w:t xml:space="preserve"> </w:t>
+      </w:r>
+      <w:r>
+        <w:rPr>
+          <w:rStyle w:val="NormalTok"/>
+        </w:rPr>
+        <w:t xml:space="preserve">facturas</w:t>
+      </w:r>
+      <w:r>
+        <w:rPr>
+          <w:rStyle w:val="NormalTok"/>
+        </w:rPr>
+        <w:t xml:space="preserve"> </w:t>
+      </w:r>
+      <w:r>
+        <w:rPr>
+          <w:rStyle w:val="OperatorTok"/>
+        </w:rPr>
+        <w:t xml:space="preserve">=</w:t>
+      </w:r>
+      <w:r>
+        <w:rPr>
+          <w:rStyle w:val="NormalTok"/>
+        </w:rPr>
+        <w:t xml:space="preserve"> </w:t>
+      </w:r>
+      <w:r>
+        <w:rPr>
+          <w:rStyle w:val="NormalTok"/>
+        </w:rPr>
+        <w:t xml:space="preserve">facturaDAO</w:t>
+      </w:r>
+      <w:r>
+        <w:rPr>
+          <w:rStyle w:val="OperatorTok"/>
+        </w:rPr>
+        <w:t xml:space="preserve">.</w:t>
+      </w:r>
+      <w:r>
+        <w:rPr>
+          <w:rStyle w:val="FunctionTok"/>
+        </w:rPr>
+        <w:t xml:space="preserve">listarPorCliente</w:t>
+      </w:r>
+      <w:r>
+        <w:rPr>
+          <w:rStyle w:val="OperatorTok"/>
+        </w:rPr>
+        <w:t xml:space="preserve">(</w:t>
+      </w:r>
+      <w:r>
+        <w:rPr>
+          <w:rStyle w:val="NormalTok"/>
+        </w:rPr>
+        <w:t xml:space="preserve">id</w:t>
+      </w:r>
+      <w:r>
+        <w:rPr>
+          <w:rStyle w:val="OperatorTok"/>
+        </w:rPr>
+        <w:t xml:space="preserve">)</w:t>
+      </w:r>
+      <w:r>
+        <w:rPr>
+          <w:rStyle w:val="OperatorTok"/>
+        </w:rPr>
+        <w:t xml:space="preserve">;</w:t>
+      </w:r>
+      <w:r>
+        <w:br/>
+      </w:r>
+      <w:r>
+        <w:rPr>
+          <w:rStyle w:val="NormalTok"/>
+        </w:rPr>
+        <w:t xml:space="preserve">    </w:t>
       </w:r>
       <w:r>
         <w:rPr>
           <w:rStyle w:val="ControlFlowTok"/>
         </w:rPr>
-        <w:t xml:space="preserve">throw</w:t>
+        <w:t xml:space="preserve">return</w:t>
       </w:r>
       <w:r>
         <w:rPr>
@@ -3524,7 +4771,7 @@
         <w:rPr>
           <w:rStyle w:val="FunctionTok"/>
         </w:rPr>
-        <w:t xml:space="preserve">ResponseStatusException</w:t>
+        <w:t xml:space="preserve">ClienteDetalleDTO</w:t>
       </w:r>
       <w:r>
         <w:rPr>
@@ -3536,73 +4783,7 @@
         <w:rPr>
           <w:rStyle w:val="NormalTok"/>
         </w:rPr>
-        <w:t xml:space="preserve">HttpStatus</w:t>
-      </w:r>
-      <w:r>
-        <w:rPr>
-          <w:rStyle w:val="OperatorTok"/>
-        </w:rPr>
-        <w:t xml:space="preserve">.</w:t>
-      </w:r>
-      <w:r>
-        <w:rPr>
-          <w:rStyle w:val="FunctionTok"/>
-        </w:rPr>
-        <w:t xml:space="preserve">NOT_FOUND</w:t>
-      </w:r>
-      <w:r>
-        <w:rPr>
-          <w:rStyle w:val="OperatorTok"/>
-        </w:rPr>
-        <w:t xml:space="preserve">);</w:t>
-      </w:r>
-      <w:r>
-        <w:br/>
-      </w:r>
-      <w:r>
-        <w:rPr>
-          <w:rStyle w:val="NormalTok"/>
-        </w:rPr>
-        <w:t xml:space="preserve">    </w:t>
-      </w:r>
-      <w:r>
-        <w:rPr>
-          <w:rStyle w:val="OperatorTok"/>
-        </w:rPr>
-        <w:t xml:space="preserve">}</w:t>
-      </w:r>
-      <w:r>
-        <w:br/>
-      </w:r>
-      <w:r>
-        <w:rPr>
-          <w:rStyle w:val="NormalTok"/>
-        </w:rPr>
-        <w:t xml:space="preserve">    model</w:t>
-      </w:r>
-      <w:r>
-        <w:rPr>
-          <w:rStyle w:val="OperatorTok"/>
-        </w:rPr>
-        <w:t xml:space="preserve">.</w:t>
-      </w:r>
-      <w:r>
-        <w:rPr>
-          <w:rStyle w:val="FunctionTok"/>
-        </w:rPr>
-        <w:t xml:space="preserve">addAttribute</w:t>
-      </w:r>
-      <w:r>
-        <w:rPr>
-          <w:rStyle w:val="OperatorTok"/>
-        </w:rPr>
-        <w:t xml:space="preserve">(</w:t>
-      </w:r>
-      <w:r>
-        <w:rPr>
-          <w:rStyle w:val="StringTok"/>
-        </w:rPr>
-        <w:t xml:space="preserve">"cliente"</w:t>
+        <w:t xml:space="preserve">cliente</w:t>
       </w:r>
       <w:r>
         <w:rPr>
@@ -3614,46 +4795,13 @@
         <w:rPr>
           <w:rStyle w:val="NormalTok"/>
         </w:rPr>
-        <w:t xml:space="preserve"> cliente</w:t>
-      </w:r>
-      <w:r>
-        <w:rPr>
-          <w:rStyle w:val="OperatorTok"/>
-        </w:rPr>
-        <w:t xml:space="preserve">);</w:t>
-      </w:r>
-      <w:r>
-        <w:br/>
-      </w:r>
-      <w:r>
-        <w:rPr>
-          <w:rStyle w:val="NormalTok"/>
-        </w:rPr>
-        <w:t xml:space="preserve">    model</w:t>
-      </w:r>
-      <w:r>
-        <w:rPr>
-          <w:rStyle w:val="OperatorTok"/>
-        </w:rPr>
-        <w:t xml:space="preserve">.</w:t>
-      </w:r>
-      <w:r>
-        <w:rPr>
-          <w:rStyle w:val="FunctionTok"/>
-        </w:rPr>
-        <w:t xml:space="preserve">addAttribute</w:t>
-      </w:r>
-      <w:r>
-        <w:rPr>
-          <w:rStyle w:val="OperatorTok"/>
-        </w:rPr>
-        <w:t xml:space="preserve">(</w:t>
-      </w:r>
-      <w:r>
-        <w:rPr>
-          <w:rStyle w:val="StringTok"/>
-        </w:rPr>
-        <w:t xml:space="preserve">"mascotas"</w:t>
+        <w:t xml:space="preserve"> </w:t>
+      </w:r>
+      <w:r>
+        <w:rPr>
+          <w:rStyle w:val="NormalTok"/>
+        </w:rPr>
+        <w:t xml:space="preserve">telefonos</w:t>
       </w:r>
       <w:r>
         <w:rPr>
@@ -3665,64 +4813,37 @@
         <w:rPr>
           <w:rStyle w:val="NormalTok"/>
         </w:rPr>
-        <w:t xml:space="preserve"> mascotaDAO</w:t>
-      </w:r>
-      <w:r>
-        <w:rPr>
-          <w:rStyle w:val="OperatorTok"/>
-        </w:rPr>
-        <w:t xml:space="preserve">.</w:t>
-      </w:r>
-      <w:r>
-        <w:rPr>
-          <w:rStyle w:val="FunctionTok"/>
-        </w:rPr>
-        <w:t xml:space="preserve">listarPorCliente</w:t>
-      </w:r>
-      <w:r>
-        <w:rPr>
-          <w:rStyle w:val="OperatorTok"/>
-        </w:rPr>
-        <w:t xml:space="preserve">(</w:t>
-      </w:r>
-      <w:r>
-        <w:rPr>
-          <w:rStyle w:val="NormalTok"/>
-        </w:rPr>
-        <w:t xml:space="preserve">id</w:t>
-      </w:r>
-      <w:r>
-        <w:rPr>
-          <w:rStyle w:val="OperatorTok"/>
-        </w:rPr>
-        <w:t xml:space="preserve">));</w:t>
-      </w:r>
-      <w:r>
-        <w:br/>
-      </w:r>
-      <w:r>
-        <w:rPr>
-          <w:rStyle w:val="NormalTok"/>
-        </w:rPr>
-        <w:t xml:space="preserve">    </w:t>
-      </w:r>
-      <w:r>
-        <w:rPr>
-          <w:rStyle w:val="ControlFlowTok"/>
-        </w:rPr>
-        <w:t xml:space="preserve">return</w:t>
-      </w:r>
-      <w:r>
-        <w:rPr>
-          <w:rStyle w:val="NormalTok"/>
-        </w:rPr>
-        <w:t xml:space="preserve"> </w:t>
-      </w:r>
-      <w:r>
-        <w:rPr>
-          <w:rStyle w:val="StringTok"/>
-        </w:rPr>
-        <w:t xml:space="preserve">"cliente"</w:t>
+        <w:t xml:space="preserve"> </w:t>
+      </w:r>
+      <w:r>
+        <w:rPr>
+          <w:rStyle w:val="NormalTok"/>
+        </w:rPr>
+        <w:t xml:space="preserve">mascotas</w:t>
+      </w:r>
+      <w:r>
+        <w:rPr>
+          <w:rStyle w:val="OperatorTok"/>
+        </w:rPr>
+        <w:t xml:space="preserve">,</w:t>
+      </w:r>
+      <w:r>
+        <w:rPr>
+          <w:rStyle w:val="NormalTok"/>
+        </w:rPr>
+        <w:t xml:space="preserve"> </w:t>
+      </w:r>
+      <w:r>
+        <w:rPr>
+          <w:rStyle w:val="NormalTok"/>
+        </w:rPr>
+        <w:t xml:space="preserve">facturas</w:t>
+      </w:r>
+      <w:r>
+        <w:rPr>
+          <w:rStyle w:val="OperatorTok"/>
+        </w:rPr>
+        <w:t xml:space="preserve">)</w:t>
       </w:r>
       <w:r>
         <w:rPr>

</xml_diff>